<commit_message>
docs(manuals): add the to-close card and the corrected expired bookings rule to the Spanish administrator manual (4.6)
</commit_message>
<xml_diff>
--- a/09_MANUALES/ES/WORD/09_Manual_De_Administrador.docx
+++ b/09_MANUALES/ES/WORD/09_Manual_De_Administrador.docx
@@ -2,7 +2,7 @@
 <file path=word/document.xml><?xml version="1.0" encoding="utf-8"?>
 <w:document xmlns:w="http://schemas.openxmlformats.org/wordprocessingml/2006/main" xmlns:m="http://schemas.openxmlformats.org/officeDocument/2006/math" xmlns:r="http://schemas.openxmlformats.org/officeDocument/2006/relationships" xmlns:o="urn:schemas-microsoft-com:office:office" xmlns:v="urn:schemas-microsoft-com:vml" xmlns:w10="urn:schemas-microsoft-com:office:word" xmlns:a="http://schemas.openxmlformats.org/drawingml/2006/main" xmlns:pic="http://schemas.openxmlformats.org/drawingml/2006/picture" xmlns:wp="http://schemas.openxmlformats.org/drawingml/2006/wordprocessingDrawing">
   <w:body>
-    <w:bookmarkStart w:id="156" w:name="manual-de-administrador"/>
+    <w:bookmarkStart w:id="157" w:name="manual-de-administrador"/>
     <w:p>
       <w:pPr>
         <w:pStyle w:val="Heading1"/>
@@ -64,7 +64,7 @@
         <w:pStyle w:val="BodyText"/>
       </w:pPr>
       <w:r>
-        <w:t xml:space="preserve">17 de octubre de 2026</w:t>
+        <w:t xml:space="preserve">21 de octubre de 2026</w:t>
       </w:r>
     </w:p>
     <w:p>
@@ -72,7 +72,7 @@
         <w:pStyle w:val="BodyText"/>
       </w:pPr>
       <w:r>
-        <w:t xml:space="preserve">Tipo de manual: Manual de administrador (administradores del negocio y administradores de TI) · Versión 4.1</w:t>
+        <w:t xml:space="preserve">Tipo de manual: Manual de administrador (administradores del negocio y administradores de TI) · Versión 4.6</w:t>
       </w:r>
     </w:p>
     <w:bookmarkStart w:id="20" w:name="control-de-versiones"/>
@@ -545,6 +545,162 @@
           </w:p>
         </w:tc>
       </w:tr>
+      <w:tr>
+        <w:tc>
+          <w:tcPr/>
+          <w:p>
+            <w:pPr>
+              <w:pStyle w:val="Compact"/>
+            </w:pPr>
+            <w:r>
+              <w:t xml:space="preserve">4.5</w:t>
+            </w:r>
+          </w:p>
+        </w:tc>
+        <w:tc>
+          <w:tcPr/>
+          <w:p>
+            <w:pPr>
+              <w:pStyle w:val="Compact"/>
+            </w:pPr>
+            <w:r>
+              <w:t xml:space="preserve">2026-10-21</w:t>
+            </w:r>
+          </w:p>
+        </w:tc>
+        <w:tc>
+          <w:tcPr/>
+          <w:p>
+            <w:pPr>
+              <w:pStyle w:val="Compact"/>
+            </w:pPr>
+            <w:r>
+              <w:t xml:space="preserve">Revisión contra el código y el servidor del 21 de octubre de 2026: al desactivar una cuenta su sesión deja de servir (secciones 9.4, 9.6 y 17.5); la pestaña de roles dice que el acceso lo decide el rol (sección 10.1); la cuenta de efectivo y su opción para el cliente (sección 11.4); reservas que se cierran solas, conteo único de reservas sin operario y candado de la asignación (secciones 12.3 y 12.4); comprobante de máximo 2 MB (sección 12.6); reportes con solo reservas completadas (sección 13); respaldos automáticos del servidor público (secciones 14.6 y 15.2) y encabezados de seguridad (sección 17.4). Se corrigieron la fecha y la versión de la portada y la fila de datos que antes se guardaban solo en el navegador (Tabla 12).</w:t>
+            </w:r>
+          </w:p>
+        </w:tc>
+        <w:tc>
+          <w:tcPr/>
+          <w:p>
+            <w:pPr>
+              <w:pStyle w:val="Compact"/>
+            </w:pPr>
+            <w:r>
+              <w:t xml:space="preserve">Equipo de desarrollo</w:t>
+            </w:r>
+          </w:p>
+        </w:tc>
+      </w:tr>
+      <w:tr>
+        <w:tc>
+          <w:tcPr/>
+          <w:p>
+            <w:pPr>
+              <w:pStyle w:val="Compact"/>
+            </w:pPr>
+            <w:r>
+              <w:t xml:space="preserve">4.6</w:t>
+            </w:r>
+          </w:p>
+        </w:tc>
+        <w:tc>
+          <w:tcPr/>
+          <w:p>
+            <w:pPr>
+              <w:pStyle w:val="Compact"/>
+            </w:pPr>
+            <w:r>
+              <w:t xml:space="preserve">2026-10-21</w:t>
+            </w:r>
+          </w:p>
+        </w:tc>
+        <w:tc>
+          <w:tcPr/>
+          <w:p>
+            <w:pPr>
+              <w:pStyle w:val="Compact"/>
+            </w:pPr>
+            <w:r>
+              <w:t xml:space="preserve">Cambio de la regla de las reservas que terminan sin cerrarse, revisada por el equipo la noche del 21 de octubre: solo pasa sola a No asistió la reserva confirmada que nunca tuvo operario; la que tenía operario y nadie registró queda en la tarjeta</w:t>
+            </w:r>
+            <w:r>
+              <w:t xml:space="preserve"> </w:t>
+            </w:r>
+            <w:r>
+              <w:rPr>
+                <w:b/>
+                <w:bCs/>
+              </w:rPr>
+              <w:t xml:space="preserve">Por cerrar</w:t>
+            </w:r>
+            <w:r>
+              <w:t xml:space="preserve"> </w:t>
+            </w:r>
+            <w:r>
+              <w:t xml:space="preserve">del inicio (web y app móvil), donde el administrador elige</w:t>
+            </w:r>
+            <w:r>
+              <w:t xml:space="preserve"> </w:t>
+            </w:r>
+            <w:r>
+              <w:rPr>
+                <w:b/>
+                <w:bCs/>
+              </w:rPr>
+              <w:t xml:space="preserve">Se atendió</w:t>
+            </w:r>
+            <w:r>
+              <w:t xml:space="preserve"> </w:t>
+            </w:r>
+            <w:r>
+              <w:t xml:space="preserve">o</w:t>
+            </w:r>
+            <w:r>
+              <w:t xml:space="preserve"> </w:t>
+            </w:r>
+            <w:r>
+              <w:rPr>
+                <w:b/>
+                <w:bCs/>
+              </w:rPr>
+              <w:t xml:space="preserve">No asistió</w:t>
+            </w:r>
+            <w:r>
+              <w:t xml:space="preserve"> </w:t>
+            </w:r>
+            <w:r>
+              <w:t xml:space="preserve">(secciones 6.3, 8.3, 12.3 y 12.7). Reservas sin operario con una sola regla también en la app móvil (secciones 8.3 y 12.4); variables</w:t>
+            </w:r>
+            <w:r>
+              <w:t xml:space="preserve"> </w:t>
+            </w:r>
+            <w:r>
+              <w:rPr>
+                <w:i/>
+                <w:iCs/>
+              </w:rPr>
+              <w:t xml:space="preserve">FOLLOW_UP_*</w:t>
+            </w:r>
+            <w:r>
+              <w:t xml:space="preserve"> </w:t>
+            </w:r>
+            <w:r>
+              <w:t xml:space="preserve">(sección 11.6); nuevo incidente y término del glosario (Tablas 18 y 20).</w:t>
+            </w:r>
+          </w:p>
+        </w:tc>
+        <w:tc>
+          <w:tcPr/>
+          <w:p>
+            <w:pPr>
+              <w:pStyle w:val="Compact"/>
+            </w:pPr>
+            <w:r>
+              <w:t xml:space="preserve">Equipo de desarrollo</w:t>
+            </w:r>
+          </w:p>
+        </w:tc>
+      </w:tr>
     </w:tbl>
     <w:p>
       <w:pPr>
@@ -1513,6 +1669,23 @@
       <w:pPr>
         <w:pStyle w:val="Compact"/>
         <w:numPr>
+          <w:ilvl w:val="1"/>
+          <w:numId w:val="1012"/>
+        </w:numPr>
+      </w:pPr>
+      <w:hyperlink w:anchor="X5269c10167094c46e05eade47ac39495ce29dc4">
+        <w:r>
+          <w:rPr>
+            <w:rStyle w:val="Hyperlink"/>
+          </w:rPr>
+          <w:t xml:space="preserve">14.6 Respaldos Automáticos del Servidor Público</w:t>
+        </w:r>
+      </w:hyperlink>
+    </w:p>
+    <w:p>
+      <w:pPr>
+        <w:pStyle w:val="Compact"/>
+        <w:numPr>
           <w:ilvl w:val="0"/>
           <w:numId w:val="1001"/>
         </w:numPr>
@@ -1974,7 +2147,7 @@
         <w:pStyle w:val="FirstParagraph"/>
       </w:pPr>
       <w:r>
-        <w:t xml:space="preserve">El manual se verificó contra el código fuente de la aplicación web y de los servicios (Equipo de Desarrollo Vehicle Washing, 2026b, 2026c, 2026d) y contra la documentación del proyecto actualizada al 17 de octubre de 2026 (Equipo de Desarrollo Vehicle Washing, 2026a). La aplicación web incluye un módulo de administración completo bajo la ruta</w:t>
+        <w:t xml:space="preserve">El manual se verificó contra el código fuente de la aplicación web y de los servicios (Equipo de Desarrollo Vehicle Washing, 2026b, 2026c, 2026d) y contra la documentación del proyecto actualizada al 21 de octubre de 2026 (Equipo de Desarrollo Vehicle Washing, 2026a). La aplicación web incluye un módulo de administración completo bajo la ruta</w:t>
       </w:r>
       <w:r>
         <w:t xml:space="preserve"> </w:t>
@@ -2266,7 +2439,7 @@
         <w:pStyle w:val="FirstParagraph"/>
       </w:pPr>
       <w:r>
-        <w:t xml:space="preserve">La Tabla 2 resume el estado real de cada función en la versión del 16 de octubre de 2026, revisada contra el código y con el sistema en funcionamiento.</w:t>
+        <w:t xml:space="preserve">La Tabla 2 resume el estado real de cada función en la versión del 21 de octubre de 2026, revisada contra el código y con el sistema en funcionamiento.</w:t>
       </w:r>
     </w:p>
     <w:p>
@@ -2476,7 +2649,7 @@
               <w:pStyle w:val="Compact"/>
             </w:pPr>
             <w:r>
-              <w:t xml:space="preserve">Completa en cuanto a la matriz de permisos: el servidor aplica los tres roles fijos y los permisos marcados para cada rol se guardan en el servidor (ADR-015). La matriz es informativa: todavía no cambia lo que puede hacer cada rol.</w:t>
+              <w:t xml:space="preserve">Completa en cuanto a la matriz de permisos: el servidor aplica los tres roles fijos y los permisos marcados para cada rol se guardan en el servidor (ADR-015). La matriz es informativa: todavía no cambia lo que puede hacer cada rol, y desde el 21 de octubre de 2026 la pestaña lo dice.</w:t>
             </w:r>
           </w:p>
         </w:tc>
@@ -2799,6 +2972,81 @@
             </w:pPr>
             <w:r>
               <w:t xml:space="preserve">Completa.</w:t>
+            </w:r>
+          </w:p>
+        </w:tc>
+        <w:tc>
+          <w:tcPr/>
+          <w:p>
+            <w:pPr>
+              <w:pStyle w:val="Compact"/>
+            </w:pPr>
+            <w:r>
+              <w:t xml:space="preserve">12.3</w:t>
+            </w:r>
+          </w:p>
+        </w:tc>
+      </w:tr>
+      <w:tr>
+        <w:tc>
+          <w:tcPr/>
+          <w:p>
+            <w:pPr>
+              <w:pStyle w:val="Compact"/>
+            </w:pPr>
+            <w:r>
+              <w:t xml:space="preserve">Reservas por cerrar (servicios que terminaron sin registrarse)</w:t>
+            </w:r>
+          </w:p>
+        </w:tc>
+        <w:tc>
+          <w:tcPr/>
+          <w:p>
+            <w:pPr>
+              <w:pStyle w:val="Compact"/>
+            </w:pPr>
+            <w:r>
+              <w:t xml:space="preserve">Dashboard (web y app móvil)</w:t>
+            </w:r>
+          </w:p>
+        </w:tc>
+        <w:tc>
+          <w:tcPr/>
+          <w:p>
+            <w:pPr>
+              <w:pStyle w:val="Compact"/>
+            </w:pPr>
+            <w:r>
+              <w:t xml:space="preserve">Completa desde el 21 de octubre de 2026:</w:t>
+            </w:r>
+            <w:r>
+              <w:t xml:space="preserve"> </w:t>
+            </w:r>
+            <w:r>
+              <w:rPr>
+                <w:b/>
+                <w:bCs/>
+              </w:rPr>
+              <w:t xml:space="preserve">Se atendió</w:t>
+            </w:r>
+            <w:r>
+              <w:t xml:space="preserve"> </w:t>
+            </w:r>
+            <w:r>
+              <w:t xml:space="preserve">o</w:t>
+            </w:r>
+            <w:r>
+              <w:t xml:space="preserve"> </w:t>
+            </w:r>
+            <w:r>
+              <w:rPr>
+                <w:b/>
+                <w:bCs/>
+              </w:rPr>
+              <w:t xml:space="preserve">No asistió</w:t>
+            </w:r>
+            <w:r>
+              <w:t xml:space="preserve">.</w:t>
             </w:r>
           </w:p>
         </w:tc>
@@ -2992,7 +3240,7 @@
               <w:pStyle w:val="Compact"/>
             </w:pPr>
             <w:r>
-              <w:t xml:space="preserve">Completa (calculados en el navegador a partir de reservas y pagos).</w:t>
+              <w:t xml:space="preserve">Completa (calculados en el navegador a partir de reservas y pagos; solo cuentan las reservas completadas).</w:t>
             </w:r>
           </w:p>
         </w:tc>
@@ -3130,7 +3378,7 @@
               <w:pStyle w:val="Compact"/>
             </w:pPr>
             <w:r>
-              <w:t xml:space="preserve">No son funciones de la aplicación: se hacen sobre la base de datos y la infraestructura.</w:t>
+              <w:t xml:space="preserve">No son funciones de la aplicación: se hacen sobre la base de datos y la infraestructura. En el servidor público los respaldos son automáticos desde el 21 de octubre de 2026.</w:t>
             </w:r>
           </w:p>
         </w:tc>
@@ -4407,7 +4655,7 @@
               <w:pStyle w:val="Compact"/>
             </w:pPr>
             <w:r>
-              <w:t xml:space="preserve">Reservas confirmadas que esperan un técnico.</w:t>
+              <w:t xml:space="preserve">Reservas programadas o confirmadas que esperan un técnico y cuya hora no ha terminado; desde el 21 de octubre de 2026 es el mismo conteo de la pantalla Reservas, en la web y en la app móvil.</w:t>
             </w:r>
           </w:p>
         </w:tc>
@@ -4429,6 +4677,67 @@
             </w:r>
             <w:r>
               <w:t xml:space="preserve">(sección 12.4).</w:t>
+            </w:r>
+          </w:p>
+        </w:tc>
+      </w:tr>
+      <w:tr>
+        <w:tc>
+          <w:tcPr/>
+          <w:p>
+            <w:pPr>
+              <w:pStyle w:val="Compact"/>
+            </w:pPr>
+            <w:r>
+              <w:t xml:space="preserve">Por cerrar</w:t>
+            </w:r>
+          </w:p>
+        </w:tc>
+        <w:tc>
+          <w:tcPr/>
+          <w:p>
+            <w:pPr>
+              <w:pStyle w:val="Compact"/>
+            </w:pPr>
+            <w:r>
+              <w:t xml:space="preserve">Reservas con operario que terminaron y nadie registró (no se iniciaron o no se finalizaron). Solo aparece cuando hay alguna, en la web y en la app móvil.</w:t>
+            </w:r>
+          </w:p>
+        </w:tc>
+        <w:tc>
+          <w:tcPr/>
+          <w:p>
+            <w:pPr>
+              <w:pStyle w:val="Compact"/>
+            </w:pPr>
+            <w:r>
+              <w:rPr>
+                <w:b/>
+                <w:bCs/>
+              </w:rPr>
+              <w:t xml:space="preserve">Se atendió</w:t>
+            </w:r>
+            <w:r>
+              <w:t xml:space="preserve"> </w:t>
+            </w:r>
+            <w:r>
+              <w:t xml:space="preserve">o</w:t>
+            </w:r>
+            <w:r>
+              <w:t xml:space="preserve"> </w:t>
+            </w:r>
+            <w:r>
+              <w:rPr>
+                <w:b/>
+                <w:bCs/>
+              </w:rPr>
+              <w:t xml:space="preserve">No asistió</w:t>
+            </w:r>
+            <w:r>
+              <w:t xml:space="preserve"> </w:t>
+            </w:r>
+            <w:r>
+              <w:t xml:space="preserve">(sección 12.3).</w:t>
             </w:r>
           </w:p>
         </w:tc>
@@ -5849,7 +6158,7 @@
         </w:numPr>
       </w:pPr>
       <w:r>
-        <w:t xml:space="preserve">Confirmar el mensaje que advierte que la persona ya no podrá iniciar sesión.</w:t>
+        <w:t xml:space="preserve">Confirmar el mensaje que advierte que la persona ya no podrá iniciar sesión. Desde el 21 de octubre de 2026, si tenía una sesión abierta, esa sesión deja de funcionar en máximo 30 segundos en todos sus equipos.</w:t>
       </w:r>
     </w:p>
     <w:p>
@@ -6177,7 +6486,7 @@
         <w:t xml:space="preserve"> </w:t>
       </w:r>
       <w:r>
-        <w:t xml:space="preserve">(inicio, vencimiento, revocación, dirección IP y agente del navegador). Al cerrar sesión, la sesión queda marcada como revocada. Un token ya emitido no se puede revocar antes de que venza (una hora); es un riesgo aceptado en el diseño (ADR-006). Ante la sospecha de un compromiso, desactivar la cuenta, cambiar el secreto JWT si el compromiso afecta a la plataforma y revisar las sesiones:</w:t>
+        <w:t xml:space="preserve">(inicio, vencimiento, revocación, dirección IP y agente del navegador). Al cerrar sesión, la sesión queda marcada como revocada, y desactivar la cuenta revoca todas sus sesiones. Desde el 21 de octubre de 2026 el token de una sesión revocada deja de servir: security-service lo rechaza y el API Gateway lo corta antes de llegar a los demás servicios, con un margen de hasta 30 segundos (si security-service no responde, el token sirve hasta que vence, como antes). Ante la sospecha de un compromiso, desactivar la cuenta, cambiar el secreto JWT si el compromiso afecta a la plataforma y revisar las sesiones:</w:t>
       </w:r>
     </w:p>
     <w:p>
@@ -6436,7 +6745,7 @@
         <w:t xml:space="preserve">La matriz es informativa</w:t>
       </w:r>
       <w:r>
-        <w:t xml:space="preserve">: la autorización real sigue dependiendo del rol del token, por lo que marcar o desmarcar un permiso no concede ni quita acceso a ninguna pantalla ni endpoint (ADR-015). Si un permiso ya no existe, el sistema responde "Uno de los permisos elegidos ya no existe. Recarga la página e inténtalo de nuevo."</w:t>
+        <w:t xml:space="preserve">: la autorización real sigue dependiendo del rol del token, por lo que marcar o desmarcar un permiso no concede ni quita acceso a ninguna pantalla ni endpoint (ADR-015). Desde el 21 de octubre de 2026 la pestaña y el diálogo de permisos lo explican en pantalla: los roles son fijos y el acceso lo decide el rol. Si un permiso ya no existe, el sistema responde "Uno de los permisos elegidos ya no existe. Recarga la página e inténtalo de nuevo."</w:t>
       </w:r>
     </w:p>
     <w:p>
@@ -7064,7 +7373,7 @@
         <w:pStyle w:val="FirstParagraph"/>
       </w:pPr>
       <w:r>
-        <w:t xml:space="preserve">Un rol válido no basta: cada servicio también verifica la propiedad del recurso. Un operario no puede iniciar ni finalizar un servicio asignado a otro operario, y un cliente solo llega a sus propias reservas, vehículos y pagos. Cada servicio valida el token y el rol que exige cada ruta; el gateway solo enruta las solicitudes y no valida tokens (ADR-006). Una solicitud de un rol a un recurso de otro devuelve el error 403.</w:t>
+        <w:t xml:space="preserve">Un rol válido no basta: cada servicio también verifica la propiedad del recurso. Un operario no puede iniciar ni finalizar un servicio asignado a otro operario, y un cliente solo llega a sus propias reservas, vehículos y pagos. Cada servicio valida el token y el rol que exige cada ruta; el gateway enruta las solicitudes y no revisa la firma de los tokens (ADR-006), pero desde el 21 de octubre de 2026 corta los de sesiones cerradas. Una solicitud de un rol a un recurso de otro devuelve el error 403.</w:t>
       </w:r>
     </w:p>
     <w:bookmarkEnd w:id="61"/>
@@ -8272,7 +8581,17 @@
         <w:t xml:space="preserve"> </w:t>
       </w:r>
       <w:r>
-        <w:t xml:space="preserve">gestiona las cuentas de pago del lavadero: para cada cuenta, el método (Nequi, Daviplata o transferencia bancaria), el titular, el número de cuenta, la imagen del QR (solo PNG o JPG), las instrucciones y si está activa. Los clientes ven solo las cuentas activas de los métodos que requieren comprobante; el efectivo no tiene código QR. Un código QR o una cuenta equivocados envían el dinero del lavadero a un tercero, por lo que esta información se debe revisar con cuidado.</w:t>
+        <w:t xml:space="preserve">gestiona las cuentas de pago del lavadero: para cada cuenta, el método (Nequi, Daviplata o transferencia bancaria), el titular, el número de cuenta, la imagen del QR (solo PNG o JPG), las instrucciones y si está activa. Los clientes ven solo las cuentas activas. La cuenta de efectivo (</w:t>
+      </w:r>
+      <w:r>
+        <w:rPr>
+          <w:i/>
+          <w:iCs/>
+        </w:rPr>
+        <w:t xml:space="preserve">Caja del establecimiento</w:t>
+      </w:r>
+      <w:r>
+        <w:t xml:space="preserve">) aparece en la misma lista y no tiene código QR; desde el 21 de octubre de 2026, si se desactiva, la opción Efectivo desaparece de la pantalla de pago del cliente. Un código QR o una cuenta equivocados envían el dinero del lavadero a un tercero, por lo que esta información se debe revisar con cuidado.</w:t>
       </w:r>
     </w:p>
     <w:p>
@@ -8572,6 +8891,51 @@
               <w:pStyle w:val="Compact"/>
             </w:pPr>
             <w:r>
+              <w:t xml:space="preserve">Sesión cerrada</w:t>
+            </w:r>
+          </w:p>
+        </w:tc>
+        <w:tc>
+          <w:tcPr/>
+          <w:p>
+            <w:pPr>
+              <w:pStyle w:val="Compact"/>
+            </w:pPr>
+            <w:r>
+              <w:t xml:space="preserve">El token de una sesión cerrada (cierre de sesión o cuenta desactivada) deja de servir en máximo 30 segundos (desde el 21 de octubre de 2026)</w:t>
+            </w:r>
+          </w:p>
+        </w:tc>
+        <w:tc>
+          <w:tcPr/>
+          <w:p>
+            <w:pPr>
+              <w:pStyle w:val="Compact"/>
+            </w:pPr>
+            <w:r>
+              <w:t xml:space="preserve">security-service y API Gateway (</w:t>
+            </w:r>
+            <w:r>
+              <w:rPr>
+                <w:i/>
+                <w:iCs/>
+              </w:rPr>
+              <w:t xml:space="preserve">SESSION_CHECK_*</w:t>
+            </w:r>
+            <w:r>
+              <w:t xml:space="preserve">).</w:t>
+            </w:r>
+          </w:p>
+        </w:tc>
+      </w:tr>
+      <w:tr>
+        <w:tc>
+          <w:tcPr/>
+          <w:p>
+            <w:pPr>
+              <w:pStyle w:val="Compact"/>
+            </w:pPr>
+            <w:r>
               <w:t xml:space="preserve">Bloqueo de cuenta por intentos fallidos</w:t>
             </w:r>
           </w:p>
@@ -9020,7 +9384,100 @@
         <w:t xml:space="preserve"> </w:t>
       </w:r>
       <w:r>
-        <w:t xml:space="preserve">crea cuentas de demostración). Sus valores y el procedimiento de cambio se describen en el Manual de Instalación.</w:t>
+        <w:t xml:space="preserve">crea cuentas de demostración). Las del 21 de octubre de 2026,</w:t>
+      </w:r>
+      <w:r>
+        <w:t xml:space="preserve"> </w:t>
+      </w:r>
+      <w:r>
+        <w:rPr>
+          <w:i/>
+          <w:iCs/>
+        </w:rPr>
+        <w:t xml:space="preserve">SESSION_CHECK_*</w:t>
+      </w:r>
+      <w:r>
+        <w:t xml:space="preserve"> </w:t>
+      </w:r>
+      <w:r>
+        <w:t xml:space="preserve">(chequeo de sesión del gateway),</w:t>
+      </w:r>
+      <w:r>
+        <w:t xml:space="preserve"> </w:t>
+      </w:r>
+      <w:r>
+        <w:rPr>
+          <w:i/>
+          <w:iCs/>
+        </w:rPr>
+        <w:t xml:space="preserve">BOOKING_EXPIRY_*</w:t>
+      </w:r>
+      <w:r>
+        <w:t xml:space="preserve"> </w:t>
+      </w:r>
+      <w:r>
+        <w:t xml:space="preserve">(reservas que terminaron sin cerrarse;</w:t>
+      </w:r>
+      <w:r>
+        <w:t xml:space="preserve"> </w:t>
+      </w:r>
+      <w:r>
+        <w:rPr>
+          <w:i/>
+          <w:iCs/>
+        </w:rPr>
+        <w:t xml:space="preserve">BOOKING_EXPIRY_GRACE_MINUTES</w:t>
+      </w:r>
+      <w:r>
+        <w:t xml:space="preserve"> </w:t>
+      </w:r>
+      <w:r>
+        <w:t xml:space="preserve">la usan booking-service y operations-service) y</w:t>
+      </w:r>
+      <w:r>
+        <w:t xml:space="preserve"> </w:t>
+      </w:r>
+      <w:r>
+        <w:rPr>
+          <w:i/>
+          <w:iCs/>
+        </w:rPr>
+        <w:t xml:space="preserve">FOLLOW_UP_*</w:t>
+      </w:r>
+      <w:r>
+        <w:t xml:space="preserve"> </w:t>
+      </w:r>
+      <w:r>
+        <w:t xml:space="preserve">(revisión de la lista</w:t>
+      </w:r>
+      <w:r>
+        <w:t xml:space="preserve"> </w:t>
+      </w:r>
+      <w:r>
+        <w:rPr>
+          <w:b/>
+          <w:bCs/>
+        </w:rPr>
+        <w:t xml:space="preserve">Por cerrar</w:t>
+      </w:r>
+      <w:r>
+        <w:t xml:space="preserve"> </w:t>
+      </w:r>
+      <w:r>
+        <w:t xml:space="preserve">en operations-service), tienen valor por defecto y todavía no pasan por el archivo de Compose, así que en Docker no se cambian desde</w:t>
+      </w:r>
+      <w:r>
+        <w:t xml:space="preserve"> </w:t>
+      </w:r>
+      <w:r>
+        <w:rPr>
+          <w:i/>
+          <w:iCs/>
+        </w:rPr>
+        <w:t xml:space="preserve">.env</w:t>
+      </w:r>
+      <w:r>
+        <w:t xml:space="preserve">. Sus valores y el procedimiento de cambio se describen en el Manual de Instalación.</w:t>
       </w:r>
     </w:p>
     <w:bookmarkEnd w:id="78"/>
@@ -9985,6 +10442,367 @@
           <w:b/>
           <w:bCs/>
         </w:rPr>
+        <w:t xml:space="preserve">Reservas que terminaron sin cerrarse (desde el 21 de octubre de 2026).</w:t>
+      </w:r>
+      <w:r>
+        <w:t xml:space="preserve"> </w:t>
+      </w:r>
+      <w:r>
+        <w:t xml:space="preserve">El sistema solo cierra una reserva por su cuenta cuando no hay duda de lo que pasó; en los demás casos la decisión es del administrador:</w:t>
+      </w:r>
+    </w:p>
+    <w:p>
+      <w:pPr>
+        <w:pStyle w:val="Compact"/>
+        <w:numPr>
+          <w:ilvl w:val="0"/>
+          <w:numId w:val="1035"/>
+        </w:numPr>
+      </w:pPr>
+      <w:r>
+        <w:t xml:space="preserve">Una reserva</w:t>
+      </w:r>
+      <w:r>
+        <w:t xml:space="preserve"> </w:t>
+      </w:r>
+      <w:r>
+        <w:rPr>
+          <w:b/>
+          <w:bCs/>
+        </w:rPr>
+        <w:t xml:space="preserve">Programada</w:t>
+      </w:r>
+      <w:r>
+        <w:t xml:space="preserve"> </w:t>
+      </w:r>
+      <w:r>
+        <w:t xml:space="preserve">que nunca se confirmó se cancela sola una hora después de su hora de fin, con el motivo "Venció sin confirmarse", que no aparece en la lista de motivos para cancelar a mano.</w:t>
+      </w:r>
+    </w:p>
+    <w:p>
+      <w:pPr>
+        <w:pStyle w:val="Compact"/>
+        <w:numPr>
+          <w:ilvl w:val="0"/>
+          <w:numId w:val="1035"/>
+        </w:numPr>
+      </w:pPr>
+      <w:r>
+        <w:t xml:space="preserve">Una reserva</w:t>
+      </w:r>
+      <w:r>
+        <w:t xml:space="preserve"> </w:t>
+      </w:r>
+      <w:r>
+        <w:rPr>
+          <w:b/>
+          <w:bCs/>
+        </w:rPr>
+        <w:t xml:space="preserve">Confirmada</w:t>
+      </w:r>
+      <w:r>
+        <w:t xml:space="preserve"> </w:t>
+      </w:r>
+      <w:r>
+        <w:t xml:space="preserve">que nunca tuvo operario pasa sola a</w:t>
+      </w:r>
+      <w:r>
+        <w:t xml:space="preserve"> </w:t>
+      </w:r>
+      <w:r>
+        <w:rPr>
+          <w:b/>
+          <w:bCs/>
+        </w:rPr>
+        <w:t xml:space="preserve">No asistió</w:t>
+      </w:r>
+      <w:r>
+        <w:t xml:space="preserve"> </w:t>
+      </w:r>
+      <w:r>
+        <w:t xml:space="preserve">una hora después de su fin, porque nadie pudo atenderla.</w:t>
+      </w:r>
+    </w:p>
+    <w:p>
+      <w:pPr>
+        <w:pStyle w:val="Compact"/>
+        <w:numPr>
+          <w:ilvl w:val="0"/>
+          <w:numId w:val="1035"/>
+        </w:numPr>
+      </w:pPr>
+      <w:r>
+        <w:t xml:space="preserve">Una reserva</w:t>
+      </w:r>
+      <w:r>
+        <w:t xml:space="preserve"> </w:t>
+      </w:r>
+      <w:r>
+        <w:rPr>
+          <w:b/>
+          <w:bCs/>
+        </w:rPr>
+        <w:t xml:space="preserve">Confirmada con operario</w:t>
+      </w:r>
+      <w:r>
+        <w:t xml:space="preserve"> </w:t>
+      </w:r>
+      <w:r>
+        <w:t xml:space="preserve">a la que nadie le dio</w:t>
+      </w:r>
+      <w:r>
+        <w:t xml:space="preserve"> </w:t>
+      </w:r>
+      <w:r>
+        <w:rPr>
+          <w:b/>
+          <w:bCs/>
+        </w:rPr>
+        <w:t xml:space="preserve">Iniciar</w:t>
+      </w:r>
+      <w:r>
+        <w:t xml:space="preserve"> </w:t>
+      </w:r>
+      <w:r>
+        <w:t xml:space="preserve">cuando terminó su hora, o una reserva</w:t>
+      </w:r>
+      <w:r>
+        <w:t xml:space="preserve"> </w:t>
+      </w:r>
+      <w:r>
+        <w:rPr>
+          <w:b/>
+          <w:bCs/>
+        </w:rPr>
+        <w:t xml:space="preserve">En progreso</w:t>
+      </w:r>
+      <w:r>
+        <w:t xml:space="preserve"> </w:t>
+      </w:r>
+      <w:r>
+        <w:t xml:space="preserve">que nadie finalizó una hora después de su fin, nunca se marca sola: pasa a la tarjeta</w:t>
+      </w:r>
+      <w:r>
+        <w:t xml:space="preserve"> </w:t>
+      </w:r>
+      <w:r>
+        <w:rPr>
+          <w:b/>
+          <w:bCs/>
+        </w:rPr>
+        <w:t xml:space="preserve">Por cerrar</w:t>
+      </w:r>
+      <w:r>
+        <w:t xml:space="preserve"> </w:t>
+      </w:r>
+      <w:r>
+        <w:t xml:space="preserve">del inicio. El operario recibe el aviso "¿Atendiste este servicio?" y cada administrador activo el aviso "Servicio sin registrar" (sección 12.7).</w:t>
+      </w:r>
+    </w:p>
+    <w:p>
+      <w:pPr>
+        <w:pStyle w:val="FirstParagraph"/>
+      </w:pPr>
+      <w:r>
+        <w:t xml:space="preserve">Esta regla reemplazó la primera versión del mismo día, que cerraba como No asistió toda reserva que nadie iniciaba: si el operario lavaba el vehículo y olvidaba marcar</w:t>
+      </w:r>
+      <w:r>
+        <w:t xml:space="preserve"> </w:t>
+      </w:r>
+      <w:r>
+        <w:rPr>
+          <w:b/>
+          <w:bCs/>
+        </w:rPr>
+        <w:t xml:space="preserve">Iniciar</w:t>
+      </w:r>
+      <w:r>
+        <w:t xml:space="preserve">, quedaba registrado que el cliente no llegó. En ningún caso el sistema hace reembolsos: si la reserva estaba pagada, el administrador revisa el pago en</w:t>
+      </w:r>
+      <w:r>
+        <w:t xml:space="preserve"> </w:t>
+      </w:r>
+      <w:r>
+        <w:rPr>
+          <w:b/>
+          <w:bCs/>
+        </w:rPr>
+        <w:t xml:space="preserve">Pagos</w:t>
+      </w:r>
+      <w:r>
+        <w:t xml:space="preserve"> </w:t>
+      </w:r>
+      <w:r>
+        <w:t xml:space="preserve">(sección 12.6).</w:t>
+      </w:r>
+    </w:p>
+    <w:p>
+      <w:pPr>
+        <w:pStyle w:val="BodyText"/>
+      </w:pPr>
+      <w:r>
+        <w:t xml:space="preserve">Para cerrar las reservas pendientes:</w:t>
+      </w:r>
+    </w:p>
+    <w:p>
+      <w:pPr>
+        <w:pStyle w:val="Compact"/>
+        <w:numPr>
+          <w:ilvl w:val="0"/>
+          <w:numId w:val="1036"/>
+        </w:numPr>
+      </w:pPr>
+      <w:r>
+        <w:t xml:space="preserve">Ubicar la tarjeta</w:t>
+      </w:r>
+      <w:r>
+        <w:t xml:space="preserve"> </w:t>
+      </w:r>
+      <w:r>
+        <w:rPr>
+          <w:b/>
+          <w:bCs/>
+        </w:rPr>
+        <w:t xml:space="preserve">Por cerrar</w:t>
+      </w:r>
+      <w:r>
+        <w:t xml:space="preserve"> </w:t>
+      </w:r>
+      <w:r>
+        <w:t xml:space="preserve">en el</w:t>
+      </w:r>
+      <w:r>
+        <w:t xml:space="preserve"> </w:t>
+      </w:r>
+      <w:r>
+        <w:rPr>
+          <w:b/>
+          <w:bCs/>
+        </w:rPr>
+        <w:t xml:space="preserve">Dashboard</w:t>
+      </w:r>
+      <w:r>
+        <w:t xml:space="preserve"> </w:t>
+      </w:r>
+      <w:r>
+        <w:t xml:space="preserve">de la web o en el inicio de la app móvil. Solo aparece cuando hay alguna reserva pendiente y muestra las de la última semana.</w:t>
+      </w:r>
+    </w:p>
+    <w:p>
+      <w:pPr>
+        <w:pStyle w:val="Compact"/>
+        <w:numPr>
+          <w:ilvl w:val="0"/>
+          <w:numId w:val="1036"/>
+        </w:numPr>
+      </w:pPr>
+      <w:r>
+        <w:t xml:space="preserve">Confirmar con el operario si atendió el vehículo. Si todavía es el mismo día, el operario puede registrar el servicio con</w:t>
+      </w:r>
+      <w:r>
+        <w:t xml:space="preserve"> </w:t>
+      </w:r>
+      <w:r>
+        <w:rPr>
+          <w:b/>
+          <w:bCs/>
+        </w:rPr>
+        <w:t xml:space="preserve">Iniciar</w:t>
+      </w:r>
+      <w:r>
+        <w:t xml:space="preserve"> </w:t>
+      </w:r>
+      <w:r>
+        <w:t xml:space="preserve">y</w:t>
+      </w:r>
+      <w:r>
+        <w:t xml:space="preserve"> </w:t>
+      </w:r>
+      <w:r>
+        <w:rPr>
+          <w:b/>
+          <w:bCs/>
+        </w:rPr>
+        <w:t xml:space="preserve">Finalizar</w:t>
+      </w:r>
+      <w:r>
+        <w:t xml:space="preserve"> </w:t>
+      </w:r>
+      <w:r>
+        <w:t xml:space="preserve">aunque sea tarde; así se guardan sus horas reales y la reserva sale de la lista.</w:t>
+      </w:r>
+    </w:p>
+    <w:p>
+      <w:pPr>
+        <w:pStyle w:val="Compact"/>
+        <w:numPr>
+          <w:ilvl w:val="0"/>
+          <w:numId w:val="1036"/>
+        </w:numPr>
+      </w:pPr>
+      <w:r>
+        <w:t xml:space="preserve">Si el vehículo se atendió, hacer clic en</w:t>
+      </w:r>
+      <w:r>
+        <w:t xml:space="preserve"> </w:t>
+      </w:r>
+      <w:r>
+        <w:rPr>
+          <w:b/>
+          <w:bCs/>
+        </w:rPr>
+        <w:t xml:space="preserve">Se atendió</w:t>
+      </w:r>
+      <w:r>
+        <w:t xml:space="preserve">. La reserva queda Completada sin inventar horas: sin hora de inicio no cuenta para la puntualidad del operario y sin hora de fin no suma horas trabajadas, pero sí cuenta como servicio realizado y como ingreso. El cliente no recibe el aviso de que ya puede recoger el vehículo (llegaría horas tarde), pero sí puede calificar el servicio.</w:t>
+      </w:r>
+    </w:p>
+    <w:p>
+      <w:pPr>
+        <w:pStyle w:val="Compact"/>
+        <w:numPr>
+          <w:ilvl w:val="0"/>
+          <w:numId w:val="1036"/>
+        </w:numPr>
+      </w:pPr>
+      <w:r>
+        <w:t xml:space="preserve">Si el cliente no llegó, hacer clic en</w:t>
+      </w:r>
+      <w:r>
+        <w:t xml:space="preserve"> </w:t>
+      </w:r>
+      <w:r>
+        <w:rPr>
+          <w:b/>
+          <w:bCs/>
+        </w:rPr>
+        <w:t xml:space="preserve">No asistió</w:t>
+      </w:r>
+      <w:r>
+        <w:t xml:space="preserve">. Esta opción solo aplica a una reserva que nunca se inició y el estado es definitivo.</w:t>
+      </w:r>
+    </w:p>
+    <w:p>
+      <w:pPr>
+        <w:pStyle w:val="Compact"/>
+        <w:numPr>
+          <w:ilvl w:val="0"/>
+          <w:numId w:val="1036"/>
+        </w:numPr>
+      </w:pPr>
+      <w:r>
+        <w:t xml:space="preserve">Si aparece un mensaje de que la reserva ya no está por cerrar, es porque otro administrador o el operario la cerraron antes; basta con actualizar la pantalla.</w:t>
+      </w:r>
+    </w:p>
+    <w:p>
+      <w:pPr>
+        <w:pStyle w:val="FirstParagraph"/>
+      </w:pPr>
+      <w:r>
+        <w:rPr>
+          <w:b/>
+          <w:bCs/>
+        </w:rPr>
         <w:t xml:space="preserve">Tabla 9</w:t>
       </w:r>
     </w:p>
@@ -10208,7 +11026,7 @@
               <w:pStyle w:val="Compact"/>
             </w:pPr>
             <w:r>
-              <w:t xml:space="preserve">Anulada por el cliente o por el lavadero.</w:t>
+              <w:t xml:space="preserve">Anulada por el cliente o por el lavadero, o cerrada por el sistema porque pasó una hora de su fin sin confirmarse.</w:t>
             </w:r>
           </w:p>
         </w:tc>
@@ -10243,18 +11061,18 @@
               <w:pStyle w:val="Compact"/>
             </w:pPr>
             <w:r>
-              <w:t xml:space="preserve">El cliente no llegó.</w:t>
-            </w:r>
-          </w:p>
-        </w:tc>
-        <w:tc>
-          <w:tcPr/>
-          <w:p>
-            <w:pPr>
-              <w:pStyle w:val="Compact"/>
-            </w:pPr>
-            <w:r>
-              <w:t xml:space="preserve">Registrarlo y revisar patrones.</w:t>
+              <w:t xml:space="preserve">El cliente no llegó (lo marca el administrador), o la reserva confirmada terminó sin operario hace una hora (lo marca el sistema).</w:t>
+            </w:r>
+          </w:p>
+        </w:tc>
+        <w:tc>
+          <w:tcPr/>
+          <w:p>
+            <w:pPr>
+              <w:pStyle w:val="Compact"/>
+            </w:pPr>
+            <w:r>
+              <w:t xml:space="preserve">Registrarlo, revisar patrones y, si el cliente había pagado, decidir el reembolso.</w:t>
             </w:r>
           </w:p>
         </w:tc>
@@ -10396,7 +11214,20 @@
         <w:t xml:space="preserve"> </w:t>
       </w:r>
       <w:r>
-        <w:t xml:space="preserve">del Dashboard. Una reserva reprogramada conserva su operario. El administrador asigna a mano en dos casos: cuando la reserva quedó sin operario y cuando necesita cambiar el que se asignó.</w:t>
+        <w:t xml:space="preserve">del Dashboard. Desde el 21 de octubre de 2026 el Dashboard y la pantalla</w:t>
+      </w:r>
+      <w:r>
+        <w:t xml:space="preserve"> </w:t>
+      </w:r>
+      <w:r>
+        <w:rPr>
+          <w:b/>
+          <w:bCs/>
+        </w:rPr>
+        <w:t xml:space="preserve">Reservas</w:t>
+      </w:r>
+      <w:r>
+        <w:t xml:space="preserve">, en la web y en la app móvil, usan el mismo conteo: reservas programadas o confirmadas, sin operario en ningún servicio y cuya hora todavía no termina. Una reserva reprogramada conserva su operario. El administrador asigna a mano en dos casos: cuando la reserva quedó sin operario y cuando necesita cambiar el que se asignó.</w:t>
       </w:r>
     </w:p>
     <w:p>
@@ -10404,7 +11235,7 @@
         <w:pStyle w:val="Compact"/>
         <w:numPr>
           <w:ilvl w:val="0"/>
-          <w:numId w:val="1035"/>
+          <w:numId w:val="1037"/>
         </w:numPr>
       </w:pPr>
       <w:r>
@@ -10474,7 +11305,7 @@
         <w:pStyle w:val="Compact"/>
         <w:numPr>
           <w:ilvl w:val="0"/>
-          <w:numId w:val="1035"/>
+          <w:numId w:val="1037"/>
         </w:numPr>
       </w:pPr>
       <w:r>
@@ -10541,7 +11372,7 @@
         <w:pStyle w:val="Compact"/>
         <w:numPr>
           <w:ilvl w:val="0"/>
-          <w:numId w:val="1035"/>
+          <w:numId w:val="1037"/>
         </w:numPr>
       </w:pPr>
       <w:r>
@@ -10553,7 +11384,7 @@
         <w:pStyle w:val="Compact"/>
         <w:numPr>
           <w:ilvl w:val="0"/>
-          <w:numId w:val="1035"/>
+          <w:numId w:val="1037"/>
         </w:numPr>
       </w:pPr>
       <w:r>
@@ -10586,7 +11417,7 @@
         <w:pStyle w:val="BodyText"/>
       </w:pPr>
       <w:r>
-        <w:t xml:space="preserve">Solo se pueden asignar reservas en estado SCHEDULED o CONFIRMED, y el operario se puede cambiar mientras ninguna línea de la reserva haya comenzado. Si se elige un operario que no es elegible, el servidor rechaza la asignación y explica el motivo.</w:t>
+        <w:t xml:space="preserve">Solo se pueden asignar reservas en estado SCHEDULED o CONFIRMED, y el operario se puede cambiar mientras ninguna línea de la reserva haya comenzado. Si se elige un operario que no es elegible, el servidor rechaza la asignación y explica el motivo. Si la asignación automática y una manual ocurren al mismo tiempo, el sistema las hace una después de la otra, para que un operario no quede con dos servicios a la misma hora.</w:t>
       </w:r>
     </w:p>
     <w:p>
@@ -10683,7 +11514,7 @@
         <w:pStyle w:val="Compact"/>
         <w:numPr>
           <w:ilvl w:val="0"/>
-          <w:numId w:val="1036"/>
+          <w:numId w:val="1038"/>
         </w:numPr>
       </w:pPr>
       <w:r>
@@ -10721,7 +11552,7 @@
         <w:pStyle w:val="Compact"/>
         <w:numPr>
           <w:ilvl w:val="0"/>
-          <w:numId w:val="1036"/>
+          <w:numId w:val="1038"/>
         </w:numPr>
       </w:pPr>
       <w:r>
@@ -10749,7 +11580,7 @@
         <w:pStyle w:val="Compact"/>
         <w:numPr>
           <w:ilvl w:val="0"/>
-          <w:numId w:val="1036"/>
+          <w:numId w:val="1038"/>
         </w:numPr>
       </w:pPr>
       <w:r>
@@ -10803,7 +11634,7 @@
         <w:pStyle w:val="Compact"/>
         <w:numPr>
           <w:ilvl w:val="0"/>
-          <w:numId w:val="1036"/>
+          <w:numId w:val="1038"/>
         </w:numPr>
       </w:pPr>
       <w:r>
@@ -10857,7 +11688,7 @@
         <w:pStyle w:val="Compact"/>
         <w:numPr>
           <w:ilvl w:val="0"/>
-          <w:numId w:val="1036"/>
+          <w:numId w:val="1038"/>
         </w:numPr>
       </w:pPr>
       <w:r>
@@ -10913,7 +11744,7 @@
         <w:pStyle w:val="Compact"/>
         <w:numPr>
           <w:ilvl w:val="0"/>
-          <w:numId w:val="1037"/>
+          <w:numId w:val="1039"/>
         </w:numPr>
       </w:pPr>
       <w:r>
@@ -10951,7 +11782,7 @@
         <w:pStyle w:val="Compact"/>
         <w:numPr>
           <w:ilvl w:val="0"/>
-          <w:numId w:val="1037"/>
+          <w:numId w:val="1039"/>
         </w:numPr>
       </w:pPr>
       <w:r>
@@ -11040,7 +11871,7 @@
         <w:pStyle w:val="Compact"/>
         <w:numPr>
           <w:ilvl w:val="0"/>
-          <w:numId w:val="1037"/>
+          <w:numId w:val="1039"/>
         </w:numPr>
       </w:pPr>
       <w:r>
@@ -11094,7 +11925,7 @@
         <w:pStyle w:val="Compact"/>
         <w:numPr>
           <w:ilvl w:val="0"/>
-          <w:numId w:val="1037"/>
+          <w:numId w:val="1039"/>
         </w:numPr>
       </w:pPr>
       <w:r>
@@ -11532,6 +12363,51 @@
           </w:p>
         </w:tc>
       </w:tr>
+      <w:tr>
+        <w:tc>
+          <w:tcPr/>
+          <w:p>
+            <w:pPr>
+              <w:pStyle w:val="Compact"/>
+            </w:pPr>
+            <w:r>
+              <w:t xml:space="preserve">Tamaño del comprobante</w:t>
+            </w:r>
+          </w:p>
+        </w:tc>
+        <w:tc>
+          <w:tcPr/>
+          <w:p>
+            <w:pPr>
+              <w:pStyle w:val="Compact"/>
+            </w:pPr>
+            <w:r>
+              <w:t xml:space="preserve">El servidor rechaza comprobantes de más de 2 MB (</w:t>
+            </w:r>
+            <w:r>
+              <w:rPr>
+                <w:i/>
+                <w:iCs/>
+              </w:rPr>
+              <w:t xml:space="preserve">RECEIPT_TOO_LARGE</w:t>
+            </w:r>
+            <w:r>
+              <w:t xml:space="preserve">); la web y la app los reducen antes de enviarlos.</w:t>
+            </w:r>
+          </w:p>
+        </w:tc>
+        <w:tc>
+          <w:tcPr/>
+          <w:p>
+            <w:pPr>
+              <w:pStyle w:val="Compact"/>
+            </w:pPr>
+            <w:r>
+              <w:t xml:space="preserve">Si una imagen se ve borrosa, pedir al cliente una captura de pantalla del comprobante.</w:t>
+            </w:r>
+          </w:p>
+        </w:tc>
+      </w:tr>
     </w:tbl>
     <w:p>
       <w:pPr>
@@ -11568,7 +12444,7 @@
         <w:pStyle w:val="Compact"/>
         <w:numPr>
           <w:ilvl w:val="0"/>
-          <w:numId w:val="1038"/>
+          <w:numId w:val="1040"/>
         </w:numPr>
       </w:pPr>
       <w:r>
@@ -11622,7 +12498,7 @@
         <w:pStyle w:val="Compact"/>
         <w:numPr>
           <w:ilvl w:val="0"/>
-          <w:numId w:val="1038"/>
+          <w:numId w:val="1040"/>
         </w:numPr>
       </w:pPr>
       <w:r>
@@ -11695,7 +12571,7 @@
         <w:pStyle w:val="Compact"/>
         <w:numPr>
           <w:ilvl w:val="0"/>
-          <w:numId w:val="1038"/>
+          <w:numId w:val="1040"/>
         </w:numPr>
       </w:pPr>
       <w:r>
@@ -11707,7 +12583,7 @@
         <w:pStyle w:val="Compact"/>
         <w:numPr>
           <w:ilvl w:val="0"/>
-          <w:numId w:val="1038"/>
+          <w:numId w:val="1040"/>
         </w:numPr>
       </w:pPr>
       <w:r>
@@ -12019,7 +12895,23 @@
         <w:t xml:space="preserve">Ir al inicio</w:t>
       </w:r>
       <w:r>
-        <w:t xml:space="preserve">. Todo administrador activo recibe avisos al personal en la bandeja y como notificación push (nunca por correo): una nueva reserva confirmada, una reserva movida a otra hora y una reserva cancelada (con el motivo).</w:t>
+        <w:t xml:space="preserve">. Todo administrador activo recibe avisos al personal en la bandeja y como notificación push (nunca por correo): una nueva reserva confirmada, una reserva movida a otra hora, una reserva cancelada (con el motivo) y, desde el 21 de octubre de 2026, el aviso "Servicio sin registrar" cuando una reserva con operario terminó y nadie la inició o la finalizó. Ese aviso llega una sola vez por reserva y abre el inicio, donde la reserva aparece en</w:t>
+      </w:r>
+      <w:r>
+        <w:t xml:space="preserve"> </w:t>
+      </w:r>
+      <w:r>
+        <w:rPr>
+          <w:b/>
+          <w:bCs/>
+        </w:rPr>
+        <w:t xml:space="preserve">Por cerrar</w:t>
+      </w:r>
+      <w:r>
+        <w:t xml:space="preserve"> </w:t>
+      </w:r>
+      <w:r>
+        <w:t xml:space="preserve">(sección 12.3).</w:t>
       </w:r>
     </w:p>
     <w:p>
@@ -12258,7 +13150,7 @@
         <w:pStyle w:val="Compact"/>
         <w:numPr>
           <w:ilvl w:val="0"/>
-          <w:numId w:val="1039"/>
+          <w:numId w:val="1041"/>
         </w:numPr>
       </w:pPr>
       <w:r>
@@ -12328,7 +13220,7 @@
         <w:pStyle w:val="Compact"/>
         <w:numPr>
           <w:ilvl w:val="0"/>
-          <w:numId w:val="1039"/>
+          <w:numId w:val="1041"/>
         </w:numPr>
       </w:pPr>
       <w:r>
@@ -12353,7 +13245,7 @@
         <w:pStyle w:val="Compact"/>
         <w:numPr>
           <w:ilvl w:val="0"/>
-          <w:numId w:val="1039"/>
+          <w:numId w:val="1041"/>
         </w:numPr>
       </w:pPr>
       <w:r>
@@ -12381,7 +13273,7 @@
         <w:pStyle w:val="Compact"/>
         <w:numPr>
           <w:ilvl w:val="0"/>
-          <w:numId w:val="1039"/>
+          <w:numId w:val="1041"/>
         </w:numPr>
       </w:pPr>
       <w:r>
@@ -12449,7 +13341,7 @@
         <w:pStyle w:val="Compact"/>
         <w:numPr>
           <w:ilvl w:val="0"/>
-          <w:numId w:val="1040"/>
+          <w:numId w:val="1042"/>
         </w:numPr>
       </w:pPr>
       <w:r>
@@ -12519,7 +13411,7 @@
         <w:pStyle w:val="Compact"/>
         <w:numPr>
           <w:ilvl w:val="0"/>
-          <w:numId w:val="1040"/>
+          <w:numId w:val="1042"/>
         </w:numPr>
       </w:pPr>
       <w:r>
@@ -12539,7 +13431,7 @@
         <w:t xml:space="preserve"> </w:t>
       </w:r>
       <w:r>
-        <w:t xml:space="preserve">de servicios completados e ingresos del periodo.</w:t>
+        <w:t xml:space="preserve">de servicios completados e ingresos del periodo. Desde el 21 de octubre de 2026 las tarjetas y las gráficas cuentan como servicios realizados solo las reservas completadas.</w:t>
       </w:r>
     </w:p>
     <w:p>
@@ -12547,7 +13439,7 @@
         <w:pStyle w:val="Compact"/>
         <w:numPr>
           <w:ilvl w:val="0"/>
-          <w:numId w:val="1040"/>
+          <w:numId w:val="1042"/>
         </w:numPr>
       </w:pPr>
       <w:r>
@@ -12633,7 +13525,7 @@
         <w:pStyle w:val="Compact"/>
         <w:numPr>
           <w:ilvl w:val="0"/>
-          <w:numId w:val="1040"/>
+          <w:numId w:val="1042"/>
         </w:numPr>
       </w:pPr>
       <w:r>
@@ -14371,7 +15263,7 @@
     </w:p>
     <w:bookmarkEnd w:id="104"/>
     <w:bookmarkEnd w:id="105"/>
-    <w:bookmarkStart w:id="114" w:name="Xb59337f9feba840af64d5a2303438bbbb2f844b"/>
+    <w:bookmarkStart w:id="115" w:name="Xb59337f9feba840af64d5a2303438bbbb2f844b"/>
     <w:p>
       <w:pPr>
         <w:pStyle w:val="Heading2"/>
@@ -14385,7 +15277,23 @@
         <w:pStyle w:val="FirstParagraph"/>
       </w:pPr>
       <w:r>
-        <w:t xml:space="preserve">La documentación del proyecto no define una estrategia de respaldos, porque la producción está fuera de su alcance, y la aplicación no incluye un módulo de respaldos. Por lo tanto, los respaldos son una tarea del administrador de TI sobre SQL Server y los volúmenes de Docker. Esta sección propone un procedimiento basado en las prácticas de planificación de contingencias (Swanson et al., 2010) y en la documentación de SQL Server (Microsoft, s. f.). Los valores marcados como recomendaciones los debe aprobar el equipo (Anexo B).</w:t>
+        <w:t xml:space="preserve">La documentación del proyecto no define una estrategia de respaldos, porque la producción está fuera de su alcance, y la aplicación no incluye un módulo de respaldos. Por lo tanto, los respaldos son una tarea del administrador de TI sobre SQL Server y los volúmenes de Docker. En el servidor público, desde el 21 de octubre de 2026, esa tarea está automatizada con los scripts de</w:t>
+      </w:r>
+      <w:r>
+        <w:t xml:space="preserve"> </w:t>
+      </w:r>
+      <w:r>
+        <w:rPr>
+          <w:i/>
+          <w:iCs/>
+        </w:rPr>
+        <w:t xml:space="preserve">lavarapido-infra/deploy</w:t>
+      </w:r>
+      <w:r>
+        <w:t xml:space="preserve"> </w:t>
+      </w:r>
+      <w:r>
+        <w:t xml:space="preserve">(sección 14.6); las secciones 14.1 a 14.5 sirven para un equipo local y para entender lo que hacen esos scripts. Esta sección propone un procedimiento basado en las prácticas de planificación de contingencias (Swanson et al., 2010) y en la documentación de SQL Server (Microsoft, s. f.). Los valores marcados como recomendaciones los debe aprobar el equipo (Anexo B).</w:t>
       </w:r>
     </w:p>
     <w:bookmarkStart w:id="106" w:name="X241d3c2182e9596a9bd8e3da9f3dd9425fc4de0"/>
@@ -14658,29 +15566,45 @@
               <w:pStyle w:val="Compact"/>
             </w:pPr>
             <w:r>
-              <w:t xml:space="preserve">Datos solo del navegador</w:t>
-            </w:r>
-          </w:p>
-        </w:tc>
-        <w:tc>
-          <w:tcPr/>
-          <w:p>
-            <w:pPr>
-              <w:pStyle w:val="Compact"/>
-            </w:pPr>
-            <w:r>
-              <w:t xml:space="preserve">Datos del negocio e informes de inspección.</w:t>
-            </w:r>
-          </w:p>
-        </w:tc>
-        <w:tc>
-          <w:tcPr/>
-          <w:p>
-            <w:pPr>
-              <w:pStyle w:val="Compact"/>
-            </w:pPr>
-            <w:r>
-              <w:t xml:space="preserve">No están en el servidor: el administrador de TI no los puede respaldar (sección 6.3).</w:t>
+              <w:t xml:space="preserve">Datos del negocio e informes de inspección</w:t>
+            </w:r>
+          </w:p>
+        </w:tc>
+        <w:tc>
+          <w:tcPr/>
+          <w:p>
+            <w:pPr>
+              <w:pStyle w:val="Compact"/>
+            </w:pPr>
+            <w:r>
+              <w:t xml:space="preserve">Desde el 15 de octubre de 2026 se guardan en booking-service y operations-service, dentro de</w:t>
+            </w:r>
+            <w:r>
+              <w:t xml:space="preserve"> </w:t>
+            </w:r>
+            <w:r>
+              <w:rPr>
+                <w:i/>
+                <w:iCs/>
+              </w:rPr>
+              <w:t xml:space="preserve">LavaRapido</w:t>
+            </w:r>
+            <w:r>
+              <w:t xml:space="preserve"> </w:t>
+            </w:r>
+            <w:r>
+              <w:t xml:space="preserve">(sección 6.3).</w:t>
+            </w:r>
+          </w:p>
+        </w:tc>
+        <w:tc>
+          <w:tcPr/>
+          <w:p>
+            <w:pPr>
+              <w:pStyle w:val="Compact"/>
+            </w:pPr>
+            <w:r>
+              <w:t xml:space="preserve">Quedan incluidos en el BACKUP DATABASE.</w:t>
             </w:r>
           </w:p>
         </w:tc>
@@ -15072,7 +15996,7 @@
         <w:pStyle w:val="Compact"/>
         <w:numPr>
           <w:ilvl w:val="0"/>
-          <w:numId w:val="1041"/>
+          <w:numId w:val="1043"/>
         </w:numPr>
       </w:pPr>
       <w:r>
@@ -15084,7 +16008,7 @@
         <w:pStyle w:val="Compact"/>
         <w:numPr>
           <w:ilvl w:val="0"/>
-          <w:numId w:val="1041"/>
+          <w:numId w:val="1043"/>
         </w:numPr>
       </w:pPr>
       <w:r>
@@ -15096,7 +16020,7 @@
         <w:pStyle w:val="Compact"/>
         <w:numPr>
           <w:ilvl w:val="0"/>
-          <w:numId w:val="1041"/>
+          <w:numId w:val="1043"/>
         </w:numPr>
       </w:pPr>
       <w:r>
@@ -15108,7 +16032,7 @@
         <w:pStyle w:val="Compact"/>
         <w:numPr>
           <w:ilvl w:val="0"/>
-          <w:numId w:val="1041"/>
+          <w:numId w:val="1043"/>
         </w:numPr>
       </w:pPr>
       <w:r>
@@ -15120,7 +16044,7 @@
         <w:pStyle w:val="Compact"/>
         <w:numPr>
           <w:ilvl w:val="0"/>
-          <w:numId w:val="1041"/>
+          <w:numId w:val="1043"/>
         </w:numPr>
       </w:pPr>
       <w:r>
@@ -16156,7 +17080,7 @@
         <w:pStyle w:val="Compact"/>
         <w:numPr>
           <w:ilvl w:val="0"/>
-          <w:numId w:val="1042"/>
+          <w:numId w:val="1044"/>
         </w:numPr>
       </w:pPr>
       <w:r>
@@ -16181,7 +17105,7 @@
         <w:pStyle w:val="Compact"/>
         <w:numPr>
           <w:ilvl w:val="0"/>
-          <w:numId w:val="1042"/>
+          <w:numId w:val="1044"/>
         </w:numPr>
       </w:pPr>
       <w:r>
@@ -16193,7 +17117,7 @@
         <w:pStyle w:val="Compact"/>
         <w:numPr>
           <w:ilvl w:val="0"/>
-          <w:numId w:val="1042"/>
+          <w:numId w:val="1044"/>
         </w:numPr>
       </w:pPr>
       <w:r>
@@ -16217,8 +17141,214 @@
       </w:r>
     </w:p>
     <w:bookmarkEnd w:id="113"/>
+    <w:bookmarkStart w:id="114" w:name="X5269c10167094c46e05eade47ac39495ce29dc4"/>
+    <w:p>
+      <w:pPr>
+        <w:pStyle w:val="Heading3"/>
+      </w:pPr>
+      <w:r>
+        <w:t xml:space="preserve">14.6 Respaldos Automáticos del Servidor Público</w:t>
+      </w:r>
+    </w:p>
+    <w:p>
+      <w:pPr>
+        <w:pStyle w:val="FirstParagraph"/>
+      </w:pPr>
+      <w:r>
+        <w:t xml:space="preserve">Desde el 21 de octubre de 2026 el servidor público respalda la base sin intervención (Documento de Despliegue, sección 3.2):</w:t>
+      </w:r>
+    </w:p>
+    <w:p>
+      <w:pPr>
+        <w:pStyle w:val="Compact"/>
+        <w:numPr>
+          <w:ilvl w:val="0"/>
+          <w:numId w:val="1045"/>
+        </w:numPr>
+      </w:pPr>
+      <w:r>
+        <w:rPr>
+          <w:i/>
+          <w:iCs/>
+        </w:rPr>
+        <w:t xml:space="preserve">deploy/backup-db.sh</w:t>
+      </w:r>
+      <w:r>
+        <w:t xml:space="preserve"> </w:t>
+      </w:r>
+      <w:r>
+        <w:t xml:space="preserve">hace un respaldo completo con suma de comprobación, comprueba que se puede restaurar y lo guarda comprimido en</w:t>
+      </w:r>
+      <w:r>
+        <w:t xml:space="preserve"> </w:t>
+      </w:r>
+      <w:r>
+        <w:rPr>
+          <w:i/>
+          <w:iCs/>
+        </w:rPr>
+        <w:t xml:space="preserve">~/lavarapido/backups/</w:t>
+      </w:r>
+      <w:r>
+        <w:t xml:space="preserve">, con permisos solo para su dueño (600). Se conservan los últimos 14.</w:t>
+      </w:r>
+    </w:p>
+    <w:p>
+      <w:pPr>
+        <w:pStyle w:val="Compact"/>
+        <w:numPr>
+          <w:ilvl w:val="0"/>
+          <w:numId w:val="1045"/>
+        </w:numPr>
+      </w:pPr>
+      <w:r>
+        <w:t xml:space="preserve">Corre antes de cada actualización (si falla,</w:t>
+      </w:r>
+      <w:r>
+        <w:t xml:space="preserve"> </w:t>
+      </w:r>
+      <w:r>
+        <w:rPr>
+          <w:i/>
+          <w:iCs/>
+        </w:rPr>
+        <w:t xml:space="preserve">update-server.sh</w:t>
+      </w:r>
+      <w:r>
+        <w:t xml:space="preserve"> </w:t>
+      </w:r>
+      <w:r>
+        <w:t xml:space="preserve">no actualiza), 5 minutos después de encender la máquina virtual y todos los días a las 23:00 UTC (6:00 p. m. en Colombia) si está encendida.</w:t>
+      </w:r>
+    </w:p>
+    <w:p>
+      <w:pPr>
+        <w:pStyle w:val="Compact"/>
+        <w:numPr>
+          <w:ilvl w:val="0"/>
+          <w:numId w:val="1045"/>
+        </w:numPr>
+      </w:pPr>
+      <w:r>
+        <w:t xml:space="preserve">Después de cada respaldo programado,</w:t>
+      </w:r>
+      <w:r>
+        <w:t xml:space="preserve"> </w:t>
+      </w:r>
+      <w:r>
+        <w:rPr>
+          <w:i/>
+          <w:iCs/>
+        </w:rPr>
+        <w:t xml:space="preserve">deploy/verify-backup.sh</w:t>
+      </w:r>
+      <w:r>
+        <w:t xml:space="preserve"> </w:t>
+      </w:r>
+      <w:r>
+        <w:t xml:space="preserve">lo restaura con otro nombre, revisa que tenga las tablas de la base real y lo borra. Así la prueba de restauración de la sección 14.2 se hace todos los días, sin tocar la base real.</w:t>
+      </w:r>
+    </w:p>
+    <w:p>
+      <w:pPr>
+        <w:pStyle w:val="Compact"/>
+        <w:numPr>
+          <w:ilvl w:val="0"/>
+          <w:numId w:val="1045"/>
+        </w:numPr>
+      </w:pPr>
+      <w:r>
+        <w:t xml:space="preserve">Cada respaldo, verificación y restauración queda en</w:t>
+      </w:r>
+      <w:r>
+        <w:t xml:space="preserve"> </w:t>
+      </w:r>
+      <w:r>
+        <w:rPr>
+          <w:i/>
+          <w:iCs/>
+        </w:rPr>
+        <w:t xml:space="preserve">~/lavarapido/backups/backup.log</w:t>
+      </w:r>
+      <w:r>
+        <w:t xml:space="preserve">:</w:t>
+      </w:r>
+      <w:r>
+        <w:t xml:space="preserve"> </w:t>
+      </w:r>
+      <w:r>
+        <w:rPr>
+          <w:i/>
+          <w:iCs/>
+        </w:rPr>
+        <w:t xml:space="preserve">tail -20</w:t>
+      </w:r>
+      <w:r>
+        <w:t xml:space="preserve"> </w:t>
+      </w:r>
+      <w:r>
+        <w:t xml:space="preserve">muestra lo último y</w:t>
+      </w:r>
+      <w:r>
+        <w:t xml:space="preserve"> </w:t>
+      </w:r>
+      <w:r>
+        <w:rPr>
+          <w:i/>
+          <w:iCs/>
+        </w:rPr>
+        <w:t xml:space="preserve">grep FALLÓ</w:t>
+      </w:r>
+      <w:r>
+        <w:t xml:space="preserve"> </w:t>
+      </w:r>
+      <w:r>
+        <w:t xml:space="preserve">solo los problemas.</w:t>
+      </w:r>
+    </w:p>
+    <w:p>
+      <w:pPr>
+        <w:pStyle w:val="Compact"/>
+        <w:numPr>
+          <w:ilvl w:val="0"/>
+          <w:numId w:val="1045"/>
+        </w:numPr>
+      </w:pPr>
+      <w:r>
+        <w:t xml:space="preserve">La base usa el modelo de recuperación SIMPLE: con respaldos completos no hacen falta respaldos del registro de transacciones, y el registro no crece sin límite.</w:t>
+      </w:r>
+    </w:p>
+    <w:p>
+      <w:pPr>
+        <w:pStyle w:val="Compact"/>
+        <w:numPr>
+          <w:ilvl w:val="0"/>
+          <w:numId w:val="1045"/>
+        </w:numPr>
+      </w:pPr>
+      <w:r>
+        <w:t xml:space="preserve">Los respaldos viven en el mismo disco de la máquina virtual: protegen de un error o de una migración mala, no de perder la máquina. Para cumplir la regla 3-2-1 de la Tabla 13, copiarlos al computador del administrador de TI con</w:t>
+      </w:r>
+      <w:r>
+        <w:t xml:space="preserve"> </w:t>
+      </w:r>
+      <w:r>
+        <w:rPr>
+          <w:i/>
+          <w:iCs/>
+        </w:rPr>
+        <w:t xml:space="preserve">scp</w:t>
+      </w:r>
+      <w:r>
+        <w:t xml:space="preserve"> </w:t>
+      </w:r>
+      <w:r>
+        <w:t xml:space="preserve">o tomar una instantánea del disco en Azure.</w:t>
+      </w:r>
+    </w:p>
     <w:bookmarkEnd w:id="114"/>
-    <w:bookmarkStart w:id="122" w:name="Xa6507cf530425e8bd917c263862ed8d116e9317"/>
+    <w:bookmarkEnd w:id="115"/>
+    <w:bookmarkStart w:id="123" w:name="Xa6507cf530425e8bd917c263862ed8d116e9317"/>
     <w:p>
       <w:pPr>
         <w:pStyle w:val="Heading2"/>
@@ -16235,7 +17365,7 @@
         <w:t xml:space="preserve">Restaurar sobrescribe los datos actuales con los del respaldo: se pierde todo lo registrado después de él. Por esa razón, la restauración debe ser una decisión autorizada y registrada, nunca una reacción improvisada.</w:t>
       </w:r>
     </w:p>
-    <w:bookmarkStart w:id="115" w:name="X1c084625bee2c484dbafc45315298d8c91f5df3"/>
+    <w:bookmarkStart w:id="116" w:name="X1c084625bee2c484dbafc45315298d8c91f5df3"/>
     <w:p>
       <w:pPr>
         <w:pStyle w:val="Heading3"/>
@@ -16426,8 +17556,8 @@
         </w:tc>
       </w:tr>
     </w:tbl>
-    <w:bookmarkEnd w:id="115"/>
-    <w:bookmarkStart w:id="116" w:name="Xd0618684eba670373cd7420bd5300c223c0b60e"/>
+    <w:bookmarkEnd w:id="116"/>
+    <w:bookmarkStart w:id="117" w:name="Xd0618684eba670373cd7420bd5300c223c0b60e"/>
     <w:p>
       <w:pPr>
         <w:pStyle w:val="Heading3"/>
@@ -16441,7 +17571,7 @@
         <w:pStyle w:val="Compact"/>
         <w:numPr>
           <w:ilvl w:val="0"/>
-          <w:numId w:val="1043"/>
+          <w:numId w:val="1046"/>
         </w:numPr>
       </w:pPr>
       <w:r>
@@ -16453,7 +17583,7 @@
         <w:pStyle w:val="Compact"/>
         <w:numPr>
           <w:ilvl w:val="0"/>
-          <w:numId w:val="1043"/>
+          <w:numId w:val="1046"/>
         </w:numPr>
       </w:pPr>
       <w:r>
@@ -16465,7 +17595,7 @@
         <w:pStyle w:val="Compact"/>
         <w:numPr>
           <w:ilvl w:val="0"/>
-          <w:numId w:val="1043"/>
+          <w:numId w:val="1046"/>
         </w:numPr>
       </w:pPr>
       <w:r>
@@ -16477,7 +17607,7 @@
         <w:pStyle w:val="Compact"/>
         <w:numPr>
           <w:ilvl w:val="0"/>
-          <w:numId w:val="1043"/>
+          <w:numId w:val="1046"/>
         </w:numPr>
       </w:pPr>
       <w:r>
@@ -16489,7 +17619,7 @@
         <w:pStyle w:val="Compact"/>
         <w:numPr>
           <w:ilvl w:val="0"/>
-          <w:numId w:val="1043"/>
+          <w:numId w:val="1046"/>
         </w:numPr>
       </w:pPr>
       <w:r>
@@ -16501,7 +17631,7 @@
         <w:pStyle w:val="Compact"/>
         <w:numPr>
           <w:ilvl w:val="0"/>
-          <w:numId w:val="1043"/>
+          <w:numId w:val="1046"/>
         </w:numPr>
       </w:pPr>
       <w:r>
@@ -16513,7 +17643,7 @@
         <w:pStyle w:val="Compact"/>
         <w:numPr>
           <w:ilvl w:val="0"/>
-          <w:numId w:val="1043"/>
+          <w:numId w:val="1046"/>
         </w:numPr>
       </w:pPr>
       <w:r>
@@ -16525,7 +17655,7 @@
         <w:pStyle w:val="Compact"/>
         <w:numPr>
           <w:ilvl w:val="0"/>
-          <w:numId w:val="1043"/>
+          <w:numId w:val="1046"/>
         </w:numPr>
       </w:pPr>
       <w:r>
@@ -16821,7 +17951,7 @@
         <w:pStyle w:val="FirstParagraph"/>
       </w:pPr>
       <w:r>
-        <w:t xml:space="preserve">La opción</w:t>
+        <w:t xml:space="preserve">En el servidor público se usa</w:t>
       </w:r>
       <w:r>
         <w:t xml:space="preserve"> </w:t>
@@ -16831,6 +17961,57 @@
           <w:i/>
           <w:iCs/>
         </w:rPr>
+        <w:t xml:space="preserve">bash ~/lavarapido/lavarapido-infra/deploy/restore-db.sh</w:t>
+      </w:r>
+      <w:r>
+        <w:rPr>
+          <w:i/>
+          <w:iCs/>
+        </w:rPr>
+        <w:t xml:space="preserve"> </w:t>
+      </w:r>
+      <w:r>
+        <w:rPr>
+          <w:rStyle w:val="VerbatimChar"/>
+          <w:i/>
+          <w:iCs/>
+        </w:rPr>
+        <w:t xml:space="preserve">&lt;ARCHIVO&gt;</w:t>
+      </w:r>
+      <w:r>
+        <w:rPr>
+          <w:i/>
+          <w:iCs/>
+        </w:rPr>
+        <w:t xml:space="preserve">.bak.gz</w:t>
+      </w:r>
+      <w:r>
+        <w:t xml:space="preserve">: pide escribir RESTAURAR, guarda antes un respaldo de cómo estaba la base, detiene los siete servicios, restaura y los vuelve a levantar (de 2 a 3 minutos sin servicio). Con</w:t>
+      </w:r>
+      <w:r>
+        <w:t xml:space="preserve"> </w:t>
+      </w:r>
+      <w:r>
+        <w:rPr>
+          <w:i/>
+          <w:iCs/>
+        </w:rPr>
+        <w:t xml:space="preserve">--as LavaRapido_prueba</w:t>
+      </w:r>
+      <w:r>
+        <w:t xml:space="preserve"> </w:t>
+      </w:r>
+      <w:r>
+        <w:t xml:space="preserve">la restaura con otro nombre, sin tocar la base real, para revisar un respaldo. La opción</w:t>
+      </w:r>
+      <w:r>
+        <w:t xml:space="preserve"> </w:t>
+      </w:r>
+      <w:r>
+        <w:rPr>
+          <w:i/>
+          <w:iCs/>
+        </w:rPr>
         <w:t xml:space="preserve">WITH REPLACE</w:t>
       </w:r>
       <w:r>
@@ -16840,8 +18021,8 @@
         <w:t xml:space="preserve">sobrescribe la base de datos existente: usarla solo cuando se esté seguro del respaldo elegido. Si el comando falla a mitad de camino, la base de datos puede quedar en estado de restauración o en modo de un solo usuario; no reiniciar el contenedor sin revisar el registro de SQL Server.</w:t>
       </w:r>
     </w:p>
-    <w:bookmarkEnd w:id="116"/>
-    <w:bookmarkStart w:id="117" w:name="Xc6d13f280ea437be3eeb2f6ba9d718f6dde71ec"/>
+    <w:bookmarkEnd w:id="117"/>
+    <w:bookmarkStart w:id="118" w:name="Xc6d13f280ea437be3eeb2f6ba9d718f6dde71ec"/>
     <w:p>
       <w:pPr>
         <w:pStyle w:val="Heading3"/>
@@ -16855,7 +18036,7 @@
         <w:pStyle w:val="Compact"/>
         <w:numPr>
           <w:ilvl w:val="0"/>
-          <w:numId w:val="1044"/>
+          <w:numId w:val="1047"/>
         </w:numPr>
       </w:pPr>
       <w:r>
@@ -16867,7 +18048,7 @@
         <w:pStyle w:val="Compact"/>
         <w:numPr>
           <w:ilvl w:val="0"/>
-          <w:numId w:val="1044"/>
+          <w:numId w:val="1047"/>
         </w:numPr>
       </w:pPr>
       <w:r>
@@ -16911,7 +18092,7 @@
         <w:pStyle w:val="Compact"/>
         <w:numPr>
           <w:ilvl w:val="0"/>
-          <w:numId w:val="1044"/>
+          <w:numId w:val="1047"/>
         </w:numPr>
       </w:pPr>
       <w:r>
@@ -16923,7 +18104,7 @@
         <w:pStyle w:val="Compact"/>
         <w:numPr>
           <w:ilvl w:val="0"/>
-          <w:numId w:val="1044"/>
+          <w:numId w:val="1047"/>
         </w:numPr>
       </w:pPr>
       <w:r>
@@ -16935,7 +18116,7 @@
         <w:pStyle w:val="Compact"/>
         <w:numPr>
           <w:ilvl w:val="0"/>
-          <w:numId w:val="1044"/>
+          <w:numId w:val="1047"/>
         </w:numPr>
       </w:pPr>
       <w:r>
@@ -16966,8 +18147,8 @@
         <w:t xml:space="preserve">Los pagos transferidos a la cuenta del lavadero y no registrados por causa de la restauración se deben comparar con el extracto bancario y recuperar con los clientes.</w:t>
       </w:r>
     </w:p>
-    <w:bookmarkEnd w:id="117"/>
-    <w:bookmarkStart w:id="121" w:name="Xc0ca52c7ec661b4fbf6f536f877200bc8a3071f"/>
+    <w:bookmarkEnd w:id="118"/>
+    <w:bookmarkStart w:id="122" w:name="Xc0ca52c7ec661b4fbf6f536f877200bc8a3071f"/>
     <w:p>
       <w:pPr>
         <w:pStyle w:val="Heading3"/>
@@ -17017,18 +18198,18 @@
           <wp:inline>
             <wp:extent cx="5334000" cy="3915734"/>
             <wp:effectExtent b="0" l="0" r="0" t="0"/>
-            <wp:docPr descr="Verificación Posterior a la Restauración" title="" id="119" name="Picture"/>
+            <wp:docPr descr="Verificación Posterior a la Restauración" title="" id="120" name="Picture"/>
             <a:graphic>
               <a:graphicData uri="http://schemas.openxmlformats.org/drawingml/2006/picture">
                 <pic:pic>
                   <pic:nvPicPr>
-                    <pic:cNvPr descr="capturas/administrador-13-verificacion-posterior-a-la-restauracion.png" id="120" name="Picture"/>
+                    <pic:cNvPr descr="capturas/administrador-13-verificacion-posterior-a-la-restauracion.png" id="121" name="Picture"/>
                     <pic:cNvPicPr>
                       <a:picLocks noChangeArrowheads="1" noChangeAspect="1"/>
                     </pic:cNvPicPr>
                   </pic:nvPicPr>
                   <pic:blipFill>
-                    <a:blip r:embed="rId118"/>
+                    <a:blip r:embed="rId119"/>
                     <a:stretch>
                       <a:fillRect/>
                     </a:stretch>
@@ -17055,9 +18236,9 @@
         </w:drawing>
       </w:r>
     </w:p>
-    <w:bookmarkEnd w:id="121"/>
     <w:bookmarkEnd w:id="122"/>
-    <w:bookmarkStart w:id="129" w:name="Xd5a17fa436a7164e46dbbe8da6c9a646c29c0df"/>
+    <w:bookmarkEnd w:id="123"/>
+    <w:bookmarkStart w:id="130" w:name="Xd5a17fa436a7164e46dbbe8da6c9a646c29c0df"/>
     <w:p>
       <w:pPr>
         <w:pStyle w:val="Heading2"/>
@@ -17066,7 +18247,7 @@
         <w:t xml:space="preserve">16. Auditoría e Historial de Acciones</w:t>
       </w:r>
     </w:p>
-    <w:bookmarkStart w:id="123" w:name="X663f0ab6ef6da21fce8d6d26fc8db668584c0fa"/>
+    <w:bookmarkStart w:id="124" w:name="X663f0ab6ef6da21fce8d6d26fc8db668584c0fa"/>
     <w:p>
       <w:pPr>
         <w:pStyle w:val="Heading3"/>
@@ -17551,8 +18732,8 @@
         <w:t xml:space="preserve">Elaborado por los autores a partir de los changelogs de los servicios. Los registros nunca deben contener contraseñas, tokens ni el contenido de los comprobantes (Kent y Souppaya, 2006).</w:t>
       </w:r>
     </w:p>
-    <w:bookmarkEnd w:id="123"/>
-    <w:bookmarkStart w:id="124" w:name="X22fd9cb7df27000538b50e9b1226638fed3caed"/>
+    <w:bookmarkEnd w:id="124"/>
+    <w:bookmarkStart w:id="125" w:name="X22fd9cb7df27000538b50e9b1226638fed3caed"/>
     <w:p>
       <w:pPr>
         <w:pStyle w:val="Heading3"/>
@@ -18077,8 +19258,8 @@
         <w:t xml:space="preserve">, SYSUTCDATETIME());</w:t>
       </w:r>
     </w:p>
-    <w:bookmarkEnd w:id="124"/>
-    <w:bookmarkStart w:id="128" w:name="X14ca12c6dbf2efb3be20040dcd258eba13ae9ed"/>
+    <w:bookmarkEnd w:id="125"/>
+    <w:bookmarkStart w:id="129" w:name="X14ca12c6dbf2efb3be20040dcd258eba13ae9ed"/>
     <w:p>
       <w:pPr>
         <w:pStyle w:val="Heading3"/>
@@ -18092,7 +19273,7 @@
         <w:pStyle w:val="Compact"/>
         <w:numPr>
           <w:ilvl w:val="0"/>
-          <w:numId w:val="1045"/>
+          <w:numId w:val="1048"/>
         </w:numPr>
       </w:pPr>
       <w:r>
@@ -18104,7 +19285,7 @@
         <w:pStyle w:val="Compact"/>
         <w:numPr>
           <w:ilvl w:val="0"/>
-          <w:numId w:val="1045"/>
+          <w:numId w:val="1048"/>
         </w:numPr>
       </w:pPr>
       <w:r>
@@ -18116,7 +19297,7 @@
         <w:pStyle w:val="Compact"/>
         <w:numPr>
           <w:ilvl w:val="0"/>
-          <w:numId w:val="1045"/>
+          <w:numId w:val="1048"/>
         </w:numPr>
       </w:pPr>
       <w:r>
@@ -18128,7 +19309,7 @@
         <w:pStyle w:val="Compact"/>
         <w:numPr>
           <w:ilvl w:val="0"/>
-          <w:numId w:val="1045"/>
+          <w:numId w:val="1048"/>
         </w:numPr>
       </w:pPr>
       <w:r>
@@ -18181,18 +19362,18 @@
           <wp:inline>
             <wp:extent cx="5334000" cy="1972339"/>
             <wp:effectExtent b="0" l="0" r="0" t="0"/>
-            <wp:docPr descr="Consulta del Historial de Sesiones" title="" id="126" name="Picture"/>
+            <wp:docPr descr="Consulta del Historial de Sesiones" title="" id="127" name="Picture"/>
             <a:graphic>
               <a:graphicData uri="http://schemas.openxmlformats.org/drawingml/2006/picture">
                 <pic:pic>
                   <pic:nvPicPr>
-                    <pic:cNvPr descr="capturas/administrador-14-consulta-del-historial-de-sesiones.png" id="127" name="Picture"/>
+                    <pic:cNvPr descr="capturas/administrador-14-consulta-del-historial-de-sesiones.png" id="128" name="Picture"/>
                     <pic:cNvPicPr>
                       <a:picLocks noChangeArrowheads="1" noChangeAspect="1"/>
                     </pic:cNvPicPr>
                   </pic:nvPicPr>
                   <pic:blipFill>
-                    <a:blip r:embed="rId125"/>
+                    <a:blip r:embed="rId126"/>
                     <a:stretch>
                       <a:fillRect/>
                     </a:stretch>
@@ -18219,9 +19400,9 @@
         </w:drawing>
       </w:r>
     </w:p>
-    <w:bookmarkEnd w:id="128"/>
     <w:bookmarkEnd w:id="129"/>
-    <w:bookmarkStart w:id="138" w:name="Xe4994f6129621ff9dbc5c92fe45d5ee254447cd"/>
+    <w:bookmarkEnd w:id="130"/>
+    <w:bookmarkStart w:id="139" w:name="Xe4994f6129621ff9dbc5c92fe45d5ee254447cd"/>
     <w:p>
       <w:pPr>
         <w:pStyle w:val="Heading2"/>
@@ -18238,7 +19419,7 @@
         <w:t xml:space="preserve">La política de seguridad del proyecto se basa en la defensa en profundidad, el mínimo privilegio, los valores seguros por defecto, la seguridad desde el diseño y la confianza cero. Las siguientes recomendaciones se alinean con los controles del NIST (Joint Task Force, 2020) y con el OWASP Top 10 (OWASP Foundation, 2021).</w:t>
       </w:r>
     </w:p>
-    <w:bookmarkStart w:id="130" w:name="Xbd95e7b5552ef51e1bec8840c4beed3313a769d"/>
+    <w:bookmarkStart w:id="131" w:name="Xbd95e7b5552ef51e1bec8840c4beed3313a769d"/>
     <w:p>
       <w:pPr>
         <w:pStyle w:val="Heading3"/>
@@ -18252,7 +19433,7 @@
         <w:pStyle w:val="Compact"/>
         <w:numPr>
           <w:ilvl w:val="0"/>
-          <w:numId w:val="1046"/>
+          <w:numId w:val="1049"/>
         </w:numPr>
       </w:pPr>
       <w:r>
@@ -18264,7 +19445,7 @@
         <w:pStyle w:val="Compact"/>
         <w:numPr>
           <w:ilvl w:val="0"/>
-          <w:numId w:val="1046"/>
+          <w:numId w:val="1049"/>
         </w:numPr>
       </w:pPr>
       <w:r>
@@ -18276,7 +19457,7 @@
         <w:pStyle w:val="Compact"/>
         <w:numPr>
           <w:ilvl w:val="0"/>
-          <w:numId w:val="1046"/>
+          <w:numId w:val="1049"/>
         </w:numPr>
       </w:pPr>
       <w:r>
@@ -18288,7 +19469,7 @@
         <w:pStyle w:val="Compact"/>
         <w:numPr>
           <w:ilvl w:val="0"/>
-          <w:numId w:val="1046"/>
+          <w:numId w:val="1049"/>
         </w:numPr>
       </w:pPr>
       <w:r>
@@ -18300,7 +19481,7 @@
         <w:pStyle w:val="Compact"/>
         <w:numPr>
           <w:ilvl w:val="0"/>
-          <w:numId w:val="1046"/>
+          <w:numId w:val="1049"/>
         </w:numPr>
       </w:pPr>
       <w:r>
@@ -18312,15 +19493,15 @@
         <w:pStyle w:val="Compact"/>
         <w:numPr>
           <w:ilvl w:val="0"/>
-          <w:numId w:val="1046"/>
+          <w:numId w:val="1049"/>
         </w:numPr>
       </w:pPr>
       <w:r>
         <w:t xml:space="preserve">Cerrar la sesión al terminar y no ingresar desde equipos compartidos.</w:t>
       </w:r>
     </w:p>
-    <w:bookmarkEnd w:id="130"/>
-    <w:bookmarkStart w:id="131" w:name="Xa369057f31555d58bc9378bb6e2602f716b4f16"/>
+    <w:bookmarkEnd w:id="131"/>
+    <w:bookmarkStart w:id="132" w:name="Xa369057f31555d58bc9378bb6e2602f716b4f16"/>
     <w:p>
       <w:pPr>
         <w:pStyle w:val="Heading3"/>
@@ -18376,8 +19557,8 @@
         <w:t xml:space="preserve">), lo que sirve como prueba del consentimiento. El administrador debe consultar solo los datos necesarios para su función, no copiarlos en medios personales y atender las solicitudes de acceso o corrección de los titulares. No se recogen datos de tarjetas. Los respaldos y las exportaciones heredan la obligación de protección.</w:t>
       </w:r>
     </w:p>
-    <w:bookmarkEnd w:id="131"/>
-    <w:bookmarkStart w:id="132" w:name="X40b20b85ba97f8b453a9035f612d3bd463ebcfd"/>
+    <w:bookmarkEnd w:id="132"/>
+    <w:bookmarkStart w:id="133" w:name="X40b20b85ba97f8b453a9035f612d3bd463ebcfd"/>
     <w:p>
       <w:pPr>
         <w:pStyle w:val="Heading3"/>
@@ -18391,7 +19572,7 @@
         <w:pStyle w:val="Compact"/>
         <w:numPr>
           <w:ilvl w:val="0"/>
-          <w:numId w:val="1047"/>
+          <w:numId w:val="1050"/>
         </w:numPr>
       </w:pPr>
       <w:r>
@@ -18432,7 +19613,7 @@
         <w:pStyle w:val="Compact"/>
         <w:numPr>
           <w:ilvl w:val="0"/>
-          <w:numId w:val="1047"/>
+          <w:numId w:val="1050"/>
         </w:numPr>
       </w:pPr>
       <w:r>
@@ -18473,7 +19654,7 @@
         <w:pStyle w:val="Compact"/>
         <w:numPr>
           <w:ilvl w:val="0"/>
-          <w:numId w:val="1047"/>
+          <w:numId w:val="1050"/>
         </w:numPr>
       </w:pPr>
       <w:r>
@@ -18498,7 +19679,7 @@
         <w:pStyle w:val="Compact"/>
         <w:numPr>
           <w:ilvl w:val="0"/>
-          <w:numId w:val="1047"/>
+          <w:numId w:val="1050"/>
         </w:numPr>
       </w:pPr>
       <w:r>
@@ -18547,8 +19728,8 @@
         <w:t xml:space="preserve">).</w:t>
       </w:r>
     </w:p>
-    <w:bookmarkEnd w:id="132"/>
-    <w:bookmarkStart w:id="133" w:name="X8caef793e9c2ec5a13052b1f604565c56e8f991"/>
+    <w:bookmarkEnd w:id="133"/>
+    <w:bookmarkStart w:id="134" w:name="X8caef793e9c2ec5a13052b1f604565c56e8f991"/>
     <w:p>
       <w:pPr>
         <w:pStyle w:val="Heading3"/>
@@ -18562,7 +19743,7 @@
         <w:pStyle w:val="Compact"/>
         <w:numPr>
           <w:ilvl w:val="0"/>
-          <w:numId w:val="1048"/>
+          <w:numId w:val="1051"/>
         </w:numPr>
       </w:pPr>
       <w:r>
@@ -18574,11 +19755,37 @@
         <w:pStyle w:val="Compact"/>
         <w:numPr>
           <w:ilvl w:val="0"/>
-          <w:numId w:val="1048"/>
+          <w:numId w:val="1051"/>
         </w:numPr>
       </w:pPr>
       <w:r>
-        <w:t xml:space="preserve">Fuera del entorno local, usar HTTPS con TLS 1.2 o superior.</w:t>
+        <w:t xml:space="preserve">Fuera del entorno local, usar HTTPS con TLS 1.2 o superior. En el servidor público, Caddy agrega además encabezados de seguridad y una política de contenido (CSP) desde el 20 de octubre de 2026, y Docker revisa la salud de cada contenedor cada 30 segundos (</w:t>
+      </w:r>
+      <w:r>
+        <w:rPr>
+          <w:i/>
+          <w:iCs/>
+        </w:rPr>
+        <w:t xml:space="preserve">docker compose ps</w:t>
+      </w:r>
+      <w:r>
+        <w:t xml:space="preserve"> </w:t>
+      </w:r>
+      <w:r>
+        <w:t xml:space="preserve">muestra</w:t>
+      </w:r>
+      <w:r>
+        <w:t xml:space="preserve"> </w:t>
+      </w:r>
+      <w:r>
+        <w:rPr>
+          <w:i/>
+          <w:iCs/>
+        </w:rPr>
+        <w:t xml:space="preserve">healthy</w:t>
+      </w:r>
+      <w:r>
+        <w:t xml:space="preserve">).</w:t>
       </w:r>
     </w:p>
     <w:p>
@@ -18586,15 +19793,15 @@
         <w:pStyle w:val="Compact"/>
         <w:numPr>
           <w:ilvl w:val="0"/>
-          <w:numId w:val="1048"/>
+          <w:numId w:val="1051"/>
         </w:numPr>
       </w:pPr>
       <w:r>
         <w:t xml:space="preserve">El gateway no aplica un límite de solicitudes. El bloqueo de cuentas frena a quien intenta adivinar contraseñas, pero en un servidor expuesto a internet conviene agregar también un límite de solicitudes en el proxy (Caddy) o en el gateway.</w:t>
       </w:r>
     </w:p>
-    <w:bookmarkEnd w:id="133"/>
-    <w:bookmarkStart w:id="134" w:name="X22d781bc3d89d2124e8a75ff7e61d4ff41d790d"/>
+    <w:bookmarkEnd w:id="134"/>
+    <w:bookmarkStart w:id="135" w:name="X22d781bc3d89d2124e8a75ff7e61d4ff41d790d"/>
     <w:p>
       <w:pPr>
         <w:pStyle w:val="Heading3"/>
@@ -18672,18 +19879,18 @@
               <w:pStyle w:val="Compact"/>
             </w:pPr>
             <w:r>
-              <w:t xml:space="preserve">Un token no se revoca antes de vencer (1 hora).</w:t>
-            </w:r>
-          </w:p>
-        </w:tc>
-        <w:tc>
-          <w:tcPr/>
-          <w:p>
-            <w:pPr>
-              <w:pStyle w:val="Compact"/>
-            </w:pPr>
-            <w:r>
-              <w:t xml:space="preserve">Desactivar la cuenta y, si es grave, rotar el secreto JWT.</w:t>
+              <w:t xml:space="preserve">El token de una sesión cerrada todavía sirve hasta 30 segundos (o hasta que vence, si security-service no responde).</w:t>
+            </w:r>
+          </w:p>
+        </w:tc>
+        <w:tc>
+          <w:tcPr/>
+          <w:p>
+            <w:pPr>
+              <w:pStyle w:val="Compact"/>
+            </w:pPr>
+            <w:r>
+              <w:t xml:space="preserve">Desactivar la cuenta, que cierra todas sus sesiones, y, si es grave, rotar el secreto JWT.</w:t>
             </w:r>
           </w:p>
         </w:tc>
@@ -18875,8 +20082,8 @@
         <w:t xml:space="preserve">Elaborado por los autores a partir de ADR-004, ADR-006, ADR-008, ADR-015 y el backlog técnico del proyecto.</w:t>
       </w:r>
     </w:p>
-    <w:bookmarkEnd w:id="134"/>
-    <w:bookmarkStart w:id="135" w:name="Xacf6e5c8ba8cbabe8c6fab43e20ea603390ae87"/>
+    <w:bookmarkEnd w:id="135"/>
+    <w:bookmarkStart w:id="136" w:name="Xacf6e5c8ba8cbabe8c6fab43e20ea603390ae87"/>
     <w:p>
       <w:pPr>
         <w:pStyle w:val="Heading3"/>
@@ -18996,7 +20203,20 @@
               <w:pStyle w:val="Compact"/>
             </w:pPr>
             <w:r>
-              <w:t xml:space="preserve">El archivo del día y la bitácora de respaldos.</w:t>
+              <w:t xml:space="preserve">El archivo del día y la bitácora de respaldos (en el servidor público,</w:t>
+            </w:r>
+            <w:r>
+              <w:t xml:space="preserve"> </w:t>
+            </w:r>
+            <w:r>
+              <w:rPr>
+                <w:i/>
+                <w:iCs/>
+              </w:rPr>
+              <w:t xml:space="preserve">tail -5 ~/lavarapido/backups/backup.log</w:t>
+            </w:r>
+            <w:r>
+              <w:t xml:space="preserve">).</w:t>
             </w:r>
           </w:p>
         </w:tc>
@@ -19238,7 +20458,23 @@
               <w:pStyle w:val="Compact"/>
             </w:pPr>
             <w:r>
-              <w:t xml:space="preserve">Verificación de la sección 15.3.</w:t>
+              <w:t xml:space="preserve">Verificación de la sección 15.3 (en el servidor público,</w:t>
+            </w:r>
+            <w:r>
+              <w:t xml:space="preserve"> </w:t>
+            </w:r>
+            <w:r>
+              <w:rPr>
+                <w:i/>
+                <w:iCs/>
+              </w:rPr>
+              <w:t xml:space="preserve">verify-backup.sh</w:t>
+            </w:r>
+            <w:r>
+              <w:t xml:space="preserve"> </w:t>
+            </w:r>
+            <w:r>
+              <w:t xml:space="preserve">lo hace cada día).</w:t>
             </w:r>
           </w:p>
         </w:tc>
@@ -19636,8 +20872,8 @@
         <w:t xml:space="preserve">"DBCC CHECKDB ([LavaRapido]) WITH NO_INFOMSGS"</w:t>
       </w:r>
     </w:p>
-    <w:bookmarkEnd w:id="135"/>
-    <w:bookmarkStart w:id="136" w:name="X2b52c1efcf70773268391d6de5e4987650a3851"/>
+    <w:bookmarkEnd w:id="136"/>
+    <w:bookmarkStart w:id="137" w:name="X2b52c1efcf70773268391d6de5e4987650a3851"/>
     <w:p>
       <w:pPr>
         <w:pStyle w:val="Heading3"/>
@@ -20035,6 +21271,41 @@
               <w:pStyle w:val="Compact"/>
             </w:pPr>
             <w:r>
+              <w:t xml:space="preserve">Reservas en Por cerrar</w:t>
+            </w:r>
+          </w:p>
+        </w:tc>
+        <w:tc>
+          <w:tcPr/>
+          <w:p>
+            <w:pPr>
+              <w:pStyle w:val="Compact"/>
+            </w:pPr>
+            <w:r>
+              <w:t xml:space="preserve">El operario atendió el vehículo pero no marcó Iniciar o Finalizar, o el cliente no llegó.</w:t>
+            </w:r>
+          </w:p>
+        </w:tc>
+        <w:tc>
+          <w:tcPr/>
+          <w:p>
+            <w:pPr>
+              <w:pStyle w:val="Compact"/>
+            </w:pPr>
+            <w:r>
+              <w:t xml:space="preserve">Preguntar al operario y cerrar con Se atendió o No asistió (sección 12.3); recordar al equipo registrar cada servicio.</w:t>
+            </w:r>
+          </w:p>
+        </w:tc>
+      </w:tr>
+      <w:tr>
+        <w:tc>
+          <w:tcPr/>
+          <w:p>
+            <w:pPr>
+              <w:pStyle w:val="Compact"/>
+            </w:pPr>
+            <w:r>
               <w:t xml:space="preserve">Los pagos fallan a través del gateway en Docker</w:t>
             </w:r>
           </w:p>
@@ -20457,8 +21728,8 @@
         <w:t xml:space="preserve">Los problemas de instalación se detallan en el Manual de Instalación, sección 17.</w:t>
       </w:r>
     </w:p>
-    <w:bookmarkEnd w:id="136"/>
-    <w:bookmarkStart w:id="137" w:name="X0cf51028e4ede3c0c2e07e13d8762078c090165"/>
+    <w:bookmarkEnd w:id="137"/>
+    <w:bookmarkStart w:id="138" w:name="X0cf51028e4ede3c0c2e07e13d8762078c090165"/>
     <w:p>
       <w:pPr>
         <w:pStyle w:val="Heading3"/>
@@ -20707,9 +21978,9 @@
         <w:t xml:space="preserve">Todo incidente se debe registrar con la fecha, quién lo detectó, la descripción, la severidad, la causa, las acciones, el resultado y las medidas para evitar que se repita (Anexo C).</w:t>
       </w:r>
     </w:p>
-    <w:bookmarkEnd w:id="137"/>
     <w:bookmarkEnd w:id="138"/>
-    <w:bookmarkStart w:id="139" w:name="X6fdd594c10465666e273a650d034cc54d5f3d24"/>
+    <w:bookmarkEnd w:id="139"/>
+    <w:bookmarkStart w:id="140" w:name="X6fdd594c10465666e273a650d034cc54d5f3d24"/>
     <w:p>
       <w:pPr>
         <w:pStyle w:val="Heading2"/>
@@ -21075,18 +22346,18 @@
               <w:pStyle w:val="Compact"/>
             </w:pPr>
             <w:r>
-              <w:t xml:space="preserve">Puntos de fidelización</w:t>
-            </w:r>
-          </w:p>
-        </w:tc>
-        <w:tc>
-          <w:tcPr/>
-          <w:p>
-            <w:pPr>
-              <w:pStyle w:val="Compact"/>
-            </w:pPr>
-            <w:r>
-              <w:t xml:space="preserve">Puntos que suma cada servicio cuando se aprueba su pago; se revierten si el pago se reembolsa.</w:t>
+              <w:t xml:space="preserve">Por cerrar</w:t>
+            </w:r>
+          </w:p>
+        </w:tc>
+        <w:tc>
+          <w:tcPr/>
+          <w:p>
+            <w:pPr>
+              <w:pStyle w:val="Compact"/>
+            </w:pPr>
+            <w:r>
+              <w:t xml:space="preserve">Tarjeta del inicio con las reservas con operario que terminaron sin registrarse; el administrador las cierra con Se atendió o No asistió.</w:t>
             </w:r>
           </w:p>
         </w:tc>
@@ -21099,18 +22370,18 @@
               <w:pStyle w:val="Compact"/>
             </w:pPr>
             <w:r>
-              <w:t xml:space="preserve">Reembolso</w:t>
-            </w:r>
-          </w:p>
-        </w:tc>
-        <w:tc>
-          <w:tcPr/>
-          <w:p>
-            <w:pPr>
-              <w:pStyle w:val="Compact"/>
-            </w:pPr>
-            <w:r>
-              <w:t xml:space="preserve">Devolución del dinero de un pago aprobado, que revierte los puntos de la reserva.</w:t>
+              <w:t xml:space="preserve">Puntos de fidelización</w:t>
+            </w:r>
+          </w:p>
+        </w:tc>
+        <w:tc>
+          <w:tcPr/>
+          <w:p>
+            <w:pPr>
+              <w:pStyle w:val="Compact"/>
+            </w:pPr>
+            <w:r>
+              <w:t xml:space="preserve">Puntos que suma cada servicio cuando se aprueba su pago; se revierten si el pago se reembolsa.</w:t>
             </w:r>
           </w:p>
         </w:tc>
@@ -21123,18 +22394,18 @@
               <w:pStyle w:val="Compact"/>
             </w:pPr>
             <w:r>
-              <w:t xml:space="preserve">Respaldo</w:t>
-            </w:r>
-          </w:p>
-        </w:tc>
-        <w:tc>
-          <w:tcPr/>
-          <w:p>
-            <w:pPr>
-              <w:pStyle w:val="Compact"/>
-            </w:pPr>
-            <w:r>
-              <w:t xml:space="preserve">Copia de la base de datos que permite recuperarla.</w:t>
+              <w:t xml:space="preserve">Reembolso</w:t>
+            </w:r>
+          </w:p>
+        </w:tc>
+        <w:tc>
+          <w:tcPr/>
+          <w:p>
+            <w:pPr>
+              <w:pStyle w:val="Compact"/>
+            </w:pPr>
+            <w:r>
+              <w:t xml:space="preserve">Devolución del dinero de un pago aprobado, que revierte los puntos de la reserva.</w:t>
             </w:r>
           </w:p>
         </w:tc>
@@ -21147,18 +22418,18 @@
               <w:pStyle w:val="Compact"/>
             </w:pPr>
             <w:r>
-              <w:t xml:space="preserve">RPO</w:t>
-            </w:r>
-          </w:p>
-        </w:tc>
-        <w:tc>
-          <w:tcPr/>
-          <w:p>
-            <w:pPr>
-              <w:pStyle w:val="Compact"/>
-            </w:pPr>
-            <w:r>
-              <w:t xml:space="preserve">Pérdida máxima de datos aceptable, medida en tiempo.</w:t>
+              <w:t xml:space="preserve">Respaldo</w:t>
+            </w:r>
+          </w:p>
+        </w:tc>
+        <w:tc>
+          <w:tcPr/>
+          <w:p>
+            <w:pPr>
+              <w:pStyle w:val="Compact"/>
+            </w:pPr>
+            <w:r>
+              <w:t xml:space="preserve">Copia de la base de datos que permite recuperarla.</w:t>
             </w:r>
           </w:p>
         </w:tc>
@@ -21171,18 +22442,18 @@
               <w:pStyle w:val="Compact"/>
             </w:pPr>
             <w:r>
-              <w:t xml:space="preserve">RTO</w:t>
-            </w:r>
-          </w:p>
-        </w:tc>
-        <w:tc>
-          <w:tcPr/>
-          <w:p>
-            <w:pPr>
-              <w:pStyle w:val="Compact"/>
-            </w:pPr>
-            <w:r>
-              <w:t xml:space="preserve">Tiempo máximo aceptable para recuperar el servicio.</w:t>
+              <w:t xml:space="preserve">RPO</w:t>
+            </w:r>
+          </w:p>
+        </w:tc>
+        <w:tc>
+          <w:tcPr/>
+          <w:p>
+            <w:pPr>
+              <w:pStyle w:val="Compact"/>
+            </w:pPr>
+            <w:r>
+              <w:t xml:space="preserve">Pérdida máxima de datos aceptable, medida en tiempo.</w:t>
             </w:r>
           </w:p>
         </w:tc>
@@ -21195,6 +22466,30 @@
               <w:pStyle w:val="Compact"/>
             </w:pPr>
             <w:r>
+              <w:t xml:space="preserve">RTO</w:t>
+            </w:r>
+          </w:p>
+        </w:tc>
+        <w:tc>
+          <w:tcPr/>
+          <w:p>
+            <w:pPr>
+              <w:pStyle w:val="Compact"/>
+            </w:pPr>
+            <w:r>
+              <w:t xml:space="preserve">Tiempo máximo aceptable para recuperar el servicio.</w:t>
+            </w:r>
+          </w:p>
+        </w:tc>
+      </w:tr>
+      <w:tr>
+        <w:tc>
+          <w:tcPr/>
+          <w:p>
+            <w:pPr>
+              <w:pStyle w:val="Compact"/>
+            </w:pPr>
+            <w:r>
               <w:t xml:space="preserve">Severidad</w:t>
             </w:r>
           </w:p>
@@ -21230,8 +22525,8 @@
         <w:t xml:space="preserve">Elaborado por los autores a partir de la documentación del proyecto.</w:t>
       </w:r>
     </w:p>
-    <w:bookmarkEnd w:id="139"/>
-    <w:bookmarkStart w:id="150" w:name="referencias"/>
+    <w:bookmarkEnd w:id="140"/>
+    <w:bookmarkStart w:id="151" w:name="referencias"/>
     <w:p>
       <w:pPr>
         <w:pStyle w:val="Heading2"/>
@@ -21263,7 +22558,7 @@
       <w:r>
         <w:t xml:space="preserve"> </w:t>
       </w:r>
-      <w:hyperlink r:id="rId140">
+      <w:hyperlink r:id="rId141">
         <w:r>
           <w:rPr>
             <w:rStyle w:val="Hyperlink"/>
@@ -21298,7 +22593,7 @@
       <w:r>
         <w:t xml:space="preserve"> </w:t>
       </w:r>
-      <w:hyperlink r:id="rId141">
+      <w:hyperlink r:id="rId142">
         <w:r>
           <w:rPr>
             <w:rStyle w:val="Hyperlink"/>
@@ -21333,7 +22628,7 @@
       <w:r>
         <w:t xml:space="preserve"> </w:t>
       </w:r>
-      <w:hyperlink r:id="rId142">
+      <w:hyperlink r:id="rId143">
         <w:r>
           <w:rPr>
             <w:rStyle w:val="Hyperlink"/>
@@ -21368,7 +22663,7 @@
       <w:r>
         <w:t xml:space="preserve"> </w:t>
       </w:r>
-      <w:hyperlink r:id="rId143">
+      <w:hyperlink r:id="rId144">
         <w:r>
           <w:rPr>
             <w:rStyle w:val="Hyperlink"/>
@@ -21403,7 +22698,7 @@
       <w:r>
         <w:t xml:space="preserve"> </w:t>
       </w:r>
-      <w:hyperlink r:id="rId144">
+      <w:hyperlink r:id="rId145">
         <w:r>
           <w:rPr>
             <w:rStyle w:val="Hyperlink"/>
@@ -21438,7 +22733,7 @@
       <w:r>
         <w:t xml:space="preserve"> </w:t>
       </w:r>
-      <w:hyperlink r:id="rId145">
+      <w:hyperlink r:id="rId146">
         <w:r>
           <w:rPr>
             <w:rStyle w:val="Hyperlink"/>
@@ -21473,7 +22768,7 @@
       <w:r>
         <w:t xml:space="preserve"> </w:t>
       </w:r>
-      <w:hyperlink r:id="rId146">
+      <w:hyperlink r:id="rId147">
         <w:r>
           <w:rPr>
             <w:rStyle w:val="Hyperlink"/>
@@ -21505,7 +22800,7 @@
       <w:r>
         <w:t xml:space="preserve"> </w:t>
       </w:r>
-      <w:hyperlink r:id="rId147">
+      <w:hyperlink r:id="rId148">
         <w:r>
           <w:rPr>
             <w:rStyle w:val="Hyperlink"/>
@@ -21537,7 +22832,7 @@
       <w:r>
         <w:t xml:space="preserve"> </w:t>
       </w:r>
-      <w:hyperlink r:id="rId148">
+      <w:hyperlink r:id="rId149">
         <w:r>
           <w:rPr>
             <w:rStyle w:val="Hyperlink"/>
@@ -21596,7 +22891,7 @@
       <w:r>
         <w:t xml:space="preserve"> </w:t>
       </w:r>
-      <w:hyperlink r:id="rId149">
+      <w:hyperlink r:id="rId150">
         <w:r>
           <w:rPr>
             <w:rStyle w:val="Hyperlink"/>
@@ -21605,8 +22900,8 @@
         </w:r>
       </w:hyperlink>
     </w:p>
-    <w:bookmarkEnd w:id="150"/>
-    <w:bookmarkStart w:id="155" w:name="X80b0218b51872906238fd110cf3fb8467fb66bf"/>
+    <w:bookmarkEnd w:id="151"/>
+    <w:bookmarkStart w:id="156" w:name="X80b0218b51872906238fd110cf3fb8467fb66bf"/>
     <w:p>
       <w:pPr>
         <w:pStyle w:val="Heading2"/>
@@ -21615,7 +22910,7 @@
         <w:t xml:space="preserve">19. Anexos</w:t>
       </w:r>
     </w:p>
-    <w:bookmarkStart w:id="151" w:name="anexo-a-origen-de-las-capturas"/>
+    <w:bookmarkStart w:id="152" w:name="anexo-a-origen-de-las-capturas"/>
     <w:p>
       <w:pPr>
         <w:pStyle w:val="Heading3"/>
@@ -21671,8 +22966,8 @@
         <w:t xml:space="preserve">.</w:t>
       </w:r>
     </w:p>
-    <w:bookmarkEnd w:id="151"/>
-    <w:bookmarkStart w:id="152" w:name="Xc98337fea243bbd6c61e22d02a7b280ae810696"/>
+    <w:bookmarkEnd w:id="152"/>
+    <w:bookmarkStart w:id="153" w:name="Xc98337fea243bbd6c61e22d02a7b280ae810696"/>
     <w:p>
       <w:pPr>
         <w:pStyle w:val="Heading3"/>
@@ -21843,7 +23138,7 @@
               <w:pStyle w:val="Compact"/>
             </w:pPr>
             <w:r>
-              <w:t xml:space="preserve">No definidos; los valores propuestos se deben aprobar.</w:t>
+              <w:t xml:space="preserve">En el servidor público los respaldos son automáticos y se verifican cada día (sección 14.6); faltan aprobar los objetivos RPO y RTO y una copia fuera de la máquina virtual.</w:t>
             </w:r>
           </w:p>
         </w:tc>
@@ -21983,8 +23278,8 @@
         <w:t xml:space="preserve">Elaborado por los autores a partir de la verificación del código fuente y del backlog técnico del proyecto.</w:t>
       </w:r>
     </w:p>
-    <w:bookmarkEnd w:id="152"/>
-    <w:bookmarkStart w:id="153" w:name="Xf56c5f7caa122d71cddfd8510860859110ae06b"/>
+    <w:bookmarkEnd w:id="153"/>
+    <w:bookmarkStart w:id="154" w:name="Xf56c5f7caa122d71cddfd8510860859110ae06b"/>
     <w:p>
       <w:pPr>
         <w:pStyle w:val="Heading3"/>
@@ -22268,8 +23563,8 @@
         </w:tc>
       </w:tr>
     </w:tbl>
-    <w:bookmarkEnd w:id="153"/>
-    <w:bookmarkStart w:id="154" w:name="X4dd1fb3daea29299baaf27f8538e456a52eadf9"/>
+    <w:bookmarkEnd w:id="154"/>
+    <w:bookmarkStart w:id="155" w:name="X4dd1fb3daea29299baaf27f8538e456a52eadf9"/>
     <w:p>
       <w:pPr>
         <w:pStyle w:val="Heading3"/>
@@ -22574,9 +23869,9 @@
         <w:t xml:space="preserve">Adaptado de la lista de verificación de la guía para elaborar manuales de software (SENA, 2026).</w:t>
       </w:r>
     </w:p>
-    <w:bookmarkEnd w:id="154"/>
     <w:bookmarkEnd w:id="155"/>
     <w:bookmarkEnd w:id="156"/>
+    <w:bookmarkEnd w:id="157"/>
     <w:sectPr>
       <w:footnotePr>
         <w:numRestart w:val="eachSect"/>
@@ -23305,34 +24600,7 @@
     </w:lvlOverride>
   </w:num>
   <w:num w:numId="1035">
-    <w:abstractNumId w:val="99411"/>
-    <w:lvlOverride w:ilvl="0">
-      <w:startOverride w:val="1"/>
-    </w:lvlOverride>
-    <w:lvlOverride w:ilvl="1">
-      <w:startOverride w:val="1"/>
-    </w:lvlOverride>
-    <w:lvlOverride w:ilvl="2">
-      <w:startOverride w:val="1"/>
-    </w:lvlOverride>
-    <w:lvlOverride w:ilvl="3">
-      <w:startOverride w:val="1"/>
-    </w:lvlOverride>
-    <w:lvlOverride w:ilvl="4">
-      <w:startOverride w:val="1"/>
-    </w:lvlOverride>
-    <w:lvlOverride w:ilvl="5">
-      <w:startOverride w:val="1"/>
-    </w:lvlOverride>
-    <w:lvlOverride w:ilvl="6">
-      <w:startOverride w:val="1"/>
-    </w:lvlOverride>
-    <w:lvlOverride w:ilvl="7">
-      <w:startOverride w:val="1"/>
-    </w:lvlOverride>
-    <w:lvlOverride w:ilvl="8">
-      <w:startOverride w:val="1"/>
-    </w:lvlOverride>
+    <w:abstractNumId w:val="991"/>
   </w:num>
   <w:num w:numId="1036">
     <w:abstractNumId w:val="99411"/>
@@ -23515,7 +24783,34 @@
     </w:lvlOverride>
   </w:num>
   <w:num w:numId="1042">
-    <w:abstractNumId w:val="991"/>
+    <w:abstractNumId w:val="99411"/>
+    <w:lvlOverride w:ilvl="0">
+      <w:startOverride w:val="1"/>
+    </w:lvlOverride>
+    <w:lvlOverride w:ilvl="1">
+      <w:startOverride w:val="1"/>
+    </w:lvlOverride>
+    <w:lvlOverride w:ilvl="2">
+      <w:startOverride w:val="1"/>
+    </w:lvlOverride>
+    <w:lvlOverride w:ilvl="3">
+      <w:startOverride w:val="1"/>
+    </w:lvlOverride>
+    <w:lvlOverride w:ilvl="4">
+      <w:startOverride w:val="1"/>
+    </w:lvlOverride>
+    <w:lvlOverride w:ilvl="5">
+      <w:startOverride w:val="1"/>
+    </w:lvlOverride>
+    <w:lvlOverride w:ilvl="6">
+      <w:startOverride w:val="1"/>
+    </w:lvlOverride>
+    <w:lvlOverride w:ilvl="7">
+      <w:startOverride w:val="1"/>
+    </w:lvlOverride>
+    <w:lvlOverride w:ilvl="8">
+      <w:startOverride w:val="1"/>
+    </w:lvlOverride>
   </w:num>
   <w:num w:numId="1043">
     <w:abstractNumId w:val="99411"/>
@@ -23554,12 +24849,48 @@
     <w:abstractNumId w:val="991"/>
   </w:num>
   <w:num w:numId="1046">
-    <w:abstractNumId w:val="991"/>
+    <w:abstractNumId w:val="99411"/>
+    <w:lvlOverride w:ilvl="0">
+      <w:startOverride w:val="1"/>
+    </w:lvlOverride>
+    <w:lvlOverride w:ilvl="1">
+      <w:startOverride w:val="1"/>
+    </w:lvlOverride>
+    <w:lvlOverride w:ilvl="2">
+      <w:startOverride w:val="1"/>
+    </w:lvlOverride>
+    <w:lvlOverride w:ilvl="3">
+      <w:startOverride w:val="1"/>
+    </w:lvlOverride>
+    <w:lvlOverride w:ilvl="4">
+      <w:startOverride w:val="1"/>
+    </w:lvlOverride>
+    <w:lvlOverride w:ilvl="5">
+      <w:startOverride w:val="1"/>
+    </w:lvlOverride>
+    <w:lvlOverride w:ilvl="6">
+      <w:startOverride w:val="1"/>
+    </w:lvlOverride>
+    <w:lvlOverride w:ilvl="7">
+      <w:startOverride w:val="1"/>
+    </w:lvlOverride>
+    <w:lvlOverride w:ilvl="8">
+      <w:startOverride w:val="1"/>
+    </w:lvlOverride>
   </w:num>
   <w:num w:numId="1047">
     <w:abstractNumId w:val="991"/>
   </w:num>
   <w:num w:numId="1048">
+    <w:abstractNumId w:val="991"/>
+  </w:num>
+  <w:num w:numId="1049">
+    <w:abstractNumId w:val="991"/>
+  </w:num>
+  <w:num w:numId="1050">
+    <w:abstractNumId w:val="991"/>
+  </w:num>
+  <w:num w:numId="1051">
     <w:abstractNumId w:val="991"/>
   </w:num>
 </w:numbering>

</xml_diff>